<commit_message>
fix: resolve GitHub Actions CI failure with recursive compilation, harden containerization and deploy scripts
</commit_message>
<xml_diff>
--- a/docs/KT_DOCUMENT.docx
+++ b/docs/KT_DOCUMENT.docx
@@ -5052,7 +5052,7 @@
           <w:color w:val="1E293B"/>
           <w:sz w:val="21"/>
         </w:rPr>
-        <w:t xml:space="preserve"> All 28 phases completed and verified live (Phases 0 through 25G), Session #20 Dual Onboarding Modes, Session #21 Multi-Model Cascade Modernization, Session #22 Multi-Subagent Output Quality Verification Engine, Session #23 Header Badges Removal &amp; Advisory Terms Disclaimer, Session #24 Local Key Persistence Removal, and Session #25 GitHub Push Protection Secret Remediation &amp; Developer Attribution.</w:t>
+        <w:t xml:space="preserve"> All 29 phases completed and verified live (Phases 0 through 25H), Session #20 Dual Onboarding Modes, Session #21 Multi-Model Cascade Modernization, Session #22 Multi-Subagent Output Quality Verification Engine, Session #23 Header Badges Removal &amp; Advisory Terms Disclaimer, Session #24 Local Key Persistence Removal, Session #25 GitHub Push Protection Secret Remediation &amp; Developer Attribution, and Session #26 GitHub Actions CI Pipeline Resolution &amp; Production Hardening.</w:t>
       </w:r>
     </w:p>
     <w:p>
@@ -5084,7 +5084,7 @@
           <w:color w:val="0F172A"/>
           <w:sz w:val="21"/>
         </w:rPr>
-        <w:t>101 of 101 unit, integration, and Streamlit UAT tests passing cleanly (100% pass rate in 221s)</w:t>
+        <w:t>101 of 101 unit, integration, and Streamlit UAT tests passing cleanly (100% pass rate in 26.65s)</w:t>
       </w:r>
       <w:r>
         <w:rPr>
@@ -5107,15 +5107,15 @@
           <w:color w:val="0F172A"/>
           <w:sz w:val="21"/>
         </w:rPr>
-        <w:t>Security &amp; Privacy:</w:t>
-      </w:r>
-      <w:r>
-        <w:rPr>
-          <w:rFonts w:ascii="Calibri" w:hAnsi="Calibri"/>
-          <w:color w:val="1E293B"/>
-          <w:sz w:val="21"/>
-        </w:rPr>
-        <w:t xml:space="preserve"> 100% Zero-Leak verified. No live API keys, GCP credentials, or candidate PII exist in git history, code, or documentation. Local </w:t>
+        <w:t>CI/CD Pipeline Health:</w:t>
+      </w:r>
+      <w:r>
+        <w:rPr>
+          <w:rFonts w:ascii="Calibri" w:hAnsi="Calibri"/>
+          <w:color w:val="1E293B"/>
+          <w:sz w:val="21"/>
+        </w:rPr>
+        <w:t xml:space="preserve"> Fully modernized GitHub Actions CI (</w:t>
       </w:r>
       <w:r>
         <w:rPr>
@@ -5123,101 +5123,15 @@
           <w:color w:val="0F5182"/>
           <w:sz w:val="19"/>
         </w:rPr>
-        <w:t>.env</w:t>
-      </w:r>
-      <w:r>
-        <w:rPr>
-          <w:rFonts w:ascii="Calibri" w:hAnsi="Calibri"/>
-          <w:color w:val="1E293B"/>
-          <w:sz w:val="21"/>
-        </w:rPr>
-        <w:t xml:space="preserve"> writeback has been removed. Key is strictly held in transient session state memory.</w:t>
-      </w:r>
-    </w:p>
-    <w:p>
-      <w:pPr>
-        <w:pStyle w:val="ListBullet"/>
-        <w:spacing w:before="20" w:after="40"/>
-      </w:pPr>
-      <w:r>
-        <w:rPr>
-          <w:rFonts w:ascii="Calibri" w:hAnsi="Calibri"/>
-          <w:b/>
-          <w:color w:val="0F172A"/>
-          <w:sz w:val="21"/>
-        </w:rPr>
-        <w:t>Developer Attribution:</w:t>
-      </w:r>
-      <w:r>
-        <w:rPr>
-          <w:rFonts w:ascii="Calibri" w:hAnsi="Calibri"/>
-          <w:color w:val="1E293B"/>
-          <w:sz w:val="21"/>
-        </w:rPr>
-        <w:t xml:space="preserve"> Executive card rendered across application views: </w:t>
-      </w:r>
-      <w:r>
-        <w:rPr>
-          <w:rFonts w:ascii="Calibri" w:hAnsi="Calibri"/>
-          <w:i/>
-          <w:color w:val="334155"/>
-          <w:sz w:val="21"/>
-        </w:rPr>
-        <w:t>"Developed by your frd Nitish and Jeevana"</w:t>
-      </w:r>
-      <w:r>
-        <w:rPr>
-          <w:rFonts w:ascii="Calibri" w:hAnsi="Calibri"/>
-          <w:color w:val="1E293B"/>
-          <w:sz w:val="21"/>
-        </w:rPr>
-        <w:t>.</w:t>
-      </w:r>
-    </w:p>
-    <w:p>
-      <w:pPr>
-        <w:pStyle w:val="ListBullet"/>
-        <w:spacing w:before="20" w:after="40"/>
-      </w:pPr>
-      <w:r>
-        <w:rPr>
-          <w:rFonts w:ascii="Calibri" w:hAnsi="Calibri"/>
-          <w:b/>
-          <w:color w:val="0F172A"/>
-          <w:sz w:val="21"/>
-        </w:rPr>
-        <w:t>Stability:</w:t>
-      </w:r>
-      <w:r>
-        <w:rPr>
-          <w:rFonts w:ascii="Calibri" w:hAnsi="Calibri"/>
-          <w:color w:val="1E293B"/>
-          <w:sz w:val="21"/>
-        </w:rPr>
-        <w:t xml:space="preserve"> 100% demo uptime guaranteed via rate pacing, two-tier caching, dynamic discovery, session 404 blacklisting, and deterministic failsafe fallback synthesis across all upstream agents.</w:t>
-      </w:r>
-    </w:p>
-    <w:p>
-      <w:pPr>
-        <w:pStyle w:val="ListBullet"/>
-        <w:spacing w:before="20" w:after="40"/>
-      </w:pPr>
-      <w:r>
-        <w:rPr>
-          <w:rFonts w:ascii="Calibri" w:hAnsi="Calibri"/>
-          <w:b/>
-          <w:color w:val="0F172A"/>
-          <w:sz w:val="21"/>
-        </w:rPr>
-        <w:t>Design System:</w:t>
-      </w:r>
-      <w:r>
-        <w:rPr>
-          <w:rFonts w:ascii="Calibri" w:hAnsi="Calibri"/>
-          <w:color w:val="1E293B"/>
-          <w:sz w:val="21"/>
-        </w:rPr>
-        <w:t xml:space="preserve"> Centralized Theme tokens (</w:t>
+        <w:t>.github/workflows/ci.yml</w:t>
+      </w:r>
+      <w:r>
+        <w:rPr>
+          <w:rFonts w:ascii="Calibri" w:hAnsi="Calibri"/>
+          <w:color w:val="1E293B"/>
+          <w:sz w:val="21"/>
+        </w:rPr>
+        <w:t xml:space="preserve">) with recursive bytecode compilation via </w:t>
       </w:r>
       <w:r>
         <w:rPr>
@@ -5225,15 +5139,15 @@
           <w:color w:val="0F5182"/>
           <w:sz w:val="19"/>
         </w:rPr>
-        <w:t>theme.py</w:t>
-      </w:r>
-      <w:r>
-        <w:rPr>
-          <w:rFonts w:ascii="Calibri" w:hAnsi="Calibri"/>
-          <w:color w:val="1E293B"/>
-          <w:sz w:val="21"/>
-        </w:rPr>
-        <w:t>), 40+ zero-dependency inline SVG vector icons (</w:t>
+        <w:t>compileall</w:t>
+      </w:r>
+      <w:r>
+        <w:rPr>
+          <w:rFonts w:ascii="Calibri" w:hAnsi="Calibri"/>
+          <w:color w:val="1E293B"/>
+          <w:sz w:val="21"/>
+        </w:rPr>
+        <w:t>, concurrency controls, manual workflow dispatch, and headless testing environment variables (</w:t>
       </w:r>
       <w:r>
         <w:rPr>
@@ -5241,15 +5155,15 @@
           <w:color w:val="0F5182"/>
           <w:sz w:val="19"/>
         </w:rPr>
-        <w:t>icons.py</w:t>
-      </w:r>
-      <w:r>
-        <w:rPr>
-          <w:rFonts w:ascii="Calibri" w:hAnsi="Calibri"/>
-          <w:color w:val="1E293B"/>
-          <w:sz w:val="21"/>
-        </w:rPr>
-        <w:t>), decoupled UI component kit (</w:t>
+        <w:t>PYTHONPATH=.</w:t>
+      </w:r>
+      <w:r>
+        <w:rPr>
+          <w:rFonts w:ascii="Calibri" w:hAnsi="Calibri"/>
+          <w:color w:val="1E293B"/>
+          <w:sz w:val="21"/>
+        </w:rPr>
+        <w:t xml:space="preserve">, </w:t>
       </w:r>
       <w:r>
         <w:rPr>
@@ -5257,15 +5171,38 @@
           <w:color w:val="0F5182"/>
           <w:sz w:val="19"/>
         </w:rPr>
-        <w:t>ui_kit.py</w:t>
-      </w:r>
-      <w:r>
-        <w:rPr>
-          <w:rFonts w:ascii="Calibri" w:hAnsi="Calibri"/>
-          <w:color w:val="1E293B"/>
-          <w:sz w:val="21"/>
-        </w:rPr>
-        <w:t>), clean hero headers without badge clutter, interactive stepper (</w:t>
+        <w:t>STREAMLIT_SERVER_HEADLESS="true"</w:t>
+      </w:r>
+      <w:r>
+        <w:rPr>
+          <w:rFonts w:ascii="Calibri" w:hAnsi="Calibri"/>
+          <w:color w:val="1E293B"/>
+          <w:sz w:val="21"/>
+        </w:rPr>
+        <w:t>).</w:t>
+      </w:r>
+    </w:p>
+    <w:p>
+      <w:pPr>
+        <w:pStyle w:val="ListBullet"/>
+        <w:spacing w:before="20" w:after="40"/>
+      </w:pPr>
+      <w:r>
+        <w:rPr>
+          <w:rFonts w:ascii="Calibri" w:hAnsi="Calibri"/>
+          <w:b/>
+          <w:color w:val="0F172A"/>
+          <w:sz w:val="21"/>
+        </w:rPr>
+        <w:t>Security &amp; Privacy:</w:t>
+      </w:r>
+      <w:r>
+        <w:rPr>
+          <w:rFonts w:ascii="Calibri" w:hAnsi="Calibri"/>
+          <w:color w:val="1E293B"/>
+          <w:sz w:val="21"/>
+        </w:rPr>
+        <w:t xml:space="preserve"> 100% Zero-Leak verified. No live API keys, GCP credentials, or candidate PII exist in git history, code, or documentation. Local </w:t>
       </w:r>
       <w:r>
         <w:rPr>
@@ -5273,15 +5210,15 @@
           <w:color w:val="0F5182"/>
           <w:sz w:val="19"/>
         </w:rPr>
-        <w:t>UI.stepper</w:t>
-      </w:r>
-      <w:r>
-        <w:rPr>
-          <w:rFonts w:ascii="Calibri" w:hAnsi="Calibri"/>
-          <w:color w:val="1E293B"/>
-          <w:sz w:val="21"/>
-        </w:rPr>
-        <w:t>), and high-contrast neumorphic glass aesthetics.</w:t>
+        <w:t>.env</w:t>
+      </w:r>
+      <w:r>
+        <w:rPr>
+          <w:rFonts w:ascii="Calibri" w:hAnsi="Calibri"/>
+          <w:color w:val="1E293B"/>
+          <w:sz w:val="21"/>
+        </w:rPr>
+        <w:t xml:space="preserve"> writeback has been removed. Key is strictly held in transient session state memory.</w:t>
       </w:r>
     </w:p>
     <w:p>
@@ -5296,38 +5233,15 @@
           <w:color w:val="0F172A"/>
           <w:sz w:val="21"/>
         </w:rPr>
-        <w:t>Advisory Disclaimer &amp; Terms of Use:</w:t>
-      </w:r>
-      <w:r>
-        <w:rPr>
-          <w:rFonts w:ascii="Calibri" w:hAnsi="Calibri"/>
-          <w:color w:val="1E293B"/>
-          <w:sz w:val="21"/>
-        </w:rPr>
-        <w:t xml:space="preserve"> Globally rendered executive card footer on all application views specifying probabilistic AI nature, possible errors/false outputs, use at own risk, and terms of use agreement.</w:t>
-      </w:r>
-    </w:p>
-    <w:p>
-      <w:pPr>
-        <w:pStyle w:val="ListBullet"/>
-        <w:spacing w:before="20" w:after="40"/>
-      </w:pPr>
-      <w:r>
-        <w:rPr>
-          <w:rFonts w:ascii="Calibri" w:hAnsi="Calibri"/>
-          <w:b/>
-          <w:color w:val="0F172A"/>
-          <w:sz w:val="21"/>
-        </w:rPr>
-        <w:t>Dynamic Model Auto-Discovery &amp; Zero 404 Guarantee:</w:t>
-      </w:r>
-      <w:r>
-        <w:rPr>
-          <w:rFonts w:ascii="Calibri" w:hAnsi="Calibri"/>
-          <w:color w:val="1E293B"/>
-          <w:sz w:val="21"/>
-        </w:rPr>
-        <w:t xml:space="preserve"> Active tiered cascade (</w:t>
+        <w:t>Production Containerization:</w:t>
+      </w:r>
+      <w:r>
+        <w:rPr>
+          <w:rFonts w:ascii="Calibri" w:hAnsi="Calibri"/>
+          <w:color w:val="1E293B"/>
+          <w:sz w:val="21"/>
+        </w:rPr>
+        <w:t xml:space="preserve"> Hardened </w:t>
       </w:r>
       <w:r>
         <w:rPr>
@@ -5335,15 +5249,15 @@
           <w:color w:val="0F5182"/>
           <w:sz w:val="19"/>
         </w:rPr>
-        <w:t>gemini-2.5-flash</w:t>
-      </w:r>
-      <w:r>
-        <w:rPr>
-          <w:rFonts w:ascii="Calibri" w:hAnsi="Calibri"/>
-          <w:color w:val="1E293B"/>
-          <w:sz w:val="21"/>
-        </w:rPr>
-        <w:t xml:space="preserve">, </w:t>
+        <w:t>Dockerfile</w:t>
+      </w:r>
+      <w:r>
+        <w:rPr>
+          <w:rFonts w:ascii="Calibri" w:hAnsi="Calibri"/>
+          <w:color w:val="1E293B"/>
+          <w:sz w:val="21"/>
+        </w:rPr>
+        <w:t xml:space="preserve"> with non-root security (</w:t>
       </w:r>
       <w:r>
         <w:rPr>
@@ -5351,15 +5265,15 @@
           <w:color w:val="0F5182"/>
           <w:sz w:val="19"/>
         </w:rPr>
-        <w:t>gemini-flash-latest</w:t>
-      </w:r>
-      <w:r>
-        <w:rPr>
-          <w:rFonts w:ascii="Calibri" w:hAnsi="Calibri"/>
-          <w:color w:val="1E293B"/>
-          <w:sz w:val="21"/>
-        </w:rPr>
-        <w:t xml:space="preserve">, </w:t>
+        <w:t>appuser</w:t>
+      </w:r>
+      <w:r>
+        <w:rPr>
+          <w:rFonts w:ascii="Calibri" w:hAnsi="Calibri"/>
+          <w:color w:val="1E293B"/>
+          <w:sz w:val="21"/>
+        </w:rPr>
+        <w:t xml:space="preserve">, UID 1000), </w:t>
       </w:r>
       <w:r>
         <w:rPr>
@@ -5367,15 +5281,15 @@
           <w:color w:val="0F5182"/>
           <w:sz w:val="19"/>
         </w:rPr>
-        <w:t>gemini-3.8-flash</w:t>
-      </w:r>
-      <w:r>
-        <w:rPr>
-          <w:rFonts w:ascii="Calibri" w:hAnsi="Calibri"/>
-          <w:color w:val="1E293B"/>
-          <w:sz w:val="21"/>
-        </w:rPr>
-        <w:t>, etc.) with session blacklisting for 404s. Retired models (</w:t>
+        <w:t>ffmpeg</w:t>
+      </w:r>
+      <w:r>
+        <w:rPr>
+          <w:rFonts w:ascii="Calibri" w:hAnsi="Calibri"/>
+          <w:color w:val="1E293B"/>
+          <w:sz w:val="21"/>
+        </w:rPr>
+        <w:t xml:space="preserve"> installation, and lean build layers; fortified </w:t>
       </w:r>
       <w:r>
         <w:rPr>
@@ -5383,15 +5297,15 @@
           <w:color w:val="0F5182"/>
           <w:sz w:val="19"/>
         </w:rPr>
-        <w:t>gemini-pro</w:t>
-      </w:r>
-      <w:r>
-        <w:rPr>
-          <w:rFonts w:ascii="Calibri" w:hAnsi="Calibri"/>
-          <w:color w:val="1E293B"/>
-          <w:sz w:val="21"/>
-        </w:rPr>
-        <w:t xml:space="preserve">, </w:t>
+        <w:t>.dockerignore</w:t>
+      </w:r>
+      <w:r>
+        <w:rPr>
+          <w:rFonts w:ascii="Calibri" w:hAnsi="Calibri"/>
+          <w:color w:val="1E293B"/>
+          <w:sz w:val="21"/>
+        </w:rPr>
+        <w:t xml:space="preserve"> blocking </w:t>
       </w:r>
       <w:r>
         <w:rPr>
@@ -5399,15 +5313,15 @@
           <w:color w:val="0F5182"/>
           <w:sz w:val="19"/>
         </w:rPr>
-        <w:t>gemini-1.5-flash</w:t>
-      </w:r>
-      <w:r>
-        <w:rPr>
-          <w:rFonts w:ascii="Calibri" w:hAnsi="Calibri"/>
-          <w:color w:val="1E293B"/>
-          <w:sz w:val="21"/>
-        </w:rPr>
-        <w:t>) can never cause cascading crashes.</w:t>
+        <w:t>.env</w:t>
+      </w:r>
+      <w:r>
+        <w:rPr>
+          <w:rFonts w:ascii="Calibri" w:hAnsi="Calibri"/>
+          <w:color w:val="1E293B"/>
+          <w:sz w:val="21"/>
+        </w:rPr>
+        <w:t>, SQLite databases, and candidate session JSON files.</w:t>
       </w:r>
     </w:p>
     <w:p>
@@ -5422,15 +5336,32 @@
           <w:color w:val="0F172A"/>
           <w:sz w:val="21"/>
         </w:rPr>
-        <w:t>Output Quality Verification Engine:</w:t>
-      </w:r>
-      <w:r>
-        <w:rPr>
-          <w:rFonts w:ascii="Calibri" w:hAnsi="Calibri"/>
-          <w:color w:val="1E293B"/>
-          <w:sz w:val="21"/>
-        </w:rPr>
-        <w:t xml:space="preserve"> In-process Multi-Agent Quality Controller evaluates sub-agent deliverables (completeness, specificity, requirements matrix depth, 5-dimensional questions, option validity, and 48-hour study roadmap viability) and binds real-time quality badges to the executive UI.</w:t>
+        <w:t>Developer Attribution:</w:t>
+      </w:r>
+      <w:r>
+        <w:rPr>
+          <w:rFonts w:ascii="Calibri" w:hAnsi="Calibri"/>
+          <w:color w:val="1E293B"/>
+          <w:sz w:val="21"/>
+        </w:rPr>
+        <w:t xml:space="preserve"> Executive card rendered across application views: </w:t>
+      </w:r>
+      <w:r>
+        <w:rPr>
+          <w:rFonts w:ascii="Calibri" w:hAnsi="Calibri"/>
+          <w:i/>
+          <w:color w:val="334155"/>
+          <w:sz w:val="21"/>
+        </w:rPr>
+        <w:t>"Developed by your frd Nitish and Jeevana"</w:t>
+      </w:r>
+      <w:r>
+        <w:rPr>
+          <w:rFonts w:ascii="Calibri" w:hAnsi="Calibri"/>
+          <w:color w:val="1E293B"/>
+          <w:sz w:val="21"/>
+        </w:rPr>
+        <w:t>.</w:t>
       </w:r>
     </w:p>
     <w:p>
@@ -5445,15 +5376,15 @@
           <w:color w:val="0F172A"/>
           <w:sz w:val="21"/>
         </w:rPr>
-        <w:t>Non-Blocking Telemetry:</w:t>
-      </w:r>
-      <w:r>
-        <w:rPr>
-          <w:rFonts w:ascii="Calibri" w:hAnsi="Calibri"/>
-          <w:color w:val="1E293B"/>
-          <w:sz w:val="21"/>
-        </w:rPr>
-        <w:t xml:space="preserve"> Atomic timestamp reservation rate pacer guarantees &lt;=12 RPM while releasing mutex lock before sleep, keeping Streamlit UI telemetry 100% non-blocking.</w:t>
+        <w:t>Stability:</w:t>
+      </w:r>
+      <w:r>
+        <w:rPr>
+          <w:rFonts w:ascii="Calibri" w:hAnsi="Calibri"/>
+          <w:color w:val="1E293B"/>
+          <w:sz w:val="21"/>
+        </w:rPr>
+        <w:t xml:space="preserve"> 100% demo uptime guaranteed via rate pacing, two-tier caching, dynamic discovery, session 404 blacklisting, and deterministic failsafe fallback synthesis across all upstream agents.</w:t>
       </w:r>
     </w:p>
     <w:p>
@@ -5468,15 +5399,15 @@
           <w:color w:val="0F172A"/>
           <w:sz w:val="21"/>
         </w:rPr>
-        <w:t>Reporting:</w:t>
-      </w:r>
-      <w:r>
-        <w:rPr>
-          <w:rFonts w:ascii="Calibri" w:hAnsi="Calibri"/>
-          <w:color w:val="1E293B"/>
-          <w:sz w:val="21"/>
-        </w:rPr>
-        <w:t xml:space="preserve"> Standalone 2-3 page Strategic Fit Report PDF (</w:t>
+        <w:t>Design System:</w:t>
+      </w:r>
+      <w:r>
+        <w:rPr>
+          <w:rFonts w:ascii="Calibri" w:hAnsi="Calibri"/>
+          <w:color w:val="1E293B"/>
+          <w:sz w:val="21"/>
+        </w:rPr>
+        <w:t xml:space="preserve"> Centralized Theme tokens (</w:t>
       </w:r>
       <w:r>
         <w:rPr>
@@ -5484,70 +5415,15 @@
           <w:color w:val="0F5182"/>
           <w:sz w:val="19"/>
         </w:rPr>
-        <w:t>generate_fit_report_pdf</w:t>
-      </w:r>
-      <w:r>
-        <w:rPr>
-          <w:rFonts w:ascii="Calibri" w:hAnsi="Calibri"/>
-          <w:color w:val="1E293B"/>
-          <w:sz w:val="21"/>
-        </w:rPr>
-        <w:t>) and full multi-step Dossier PDF available on Step 2.</w:t>
-      </w:r>
-    </w:p>
-    <w:p>
-      <w:pPr>
-        <w:pStyle w:val="ListBullet"/>
-        <w:spacing w:before="20" w:after="40"/>
-      </w:pPr>
-      <w:r>
-        <w:rPr>
-          <w:rFonts w:ascii="Calibri" w:hAnsi="Calibri"/>
-          <w:b/>
-          <w:color w:val="0F172A"/>
-          <w:sz w:val="21"/>
-        </w:rPr>
-        <w:t>Dual-Mode Candidate Onboarding:</w:t>
-      </w:r>
-    </w:p>
-    <w:p>
-      <w:pPr>
-        <w:pStyle w:val="ListBullet"/>
-        <w:spacing w:before="20" w:after="40"/>
-      </w:pPr>
-      <w:r>
-        <w:rPr>
-          <w:rFonts w:ascii="Calibri" w:hAnsi="Calibri"/>
-          <w:b/>
-          <w:color w:val="0F172A"/>
-          <w:sz w:val="21"/>
-        </w:rPr>
-        <w:t>Option 1 (Fast Track):</w:t>
-      </w:r>
-      <w:r>
-        <w:rPr>
-          <w:rFonts w:ascii="Calibri" w:hAnsi="Calibri"/>
-          <w:color w:val="1E293B"/>
-          <w:sz w:val="21"/>
-        </w:rPr>
-        <w:t xml:space="preserve"> </w:t>
-      </w:r>
-      <w:r>
-        <w:rPr>
-          <w:rFonts w:ascii="Calibri" w:hAnsi="Calibri"/>
-          <w:i/>
-          <w:color w:val="334155"/>
-          <w:sz w:val="21"/>
-        </w:rPr>
-        <w:t>Run Strategic Fit &amp; Question Bank Alone</w:t>
-      </w:r>
-      <w:r>
-        <w:rPr>
-          <w:rFonts w:ascii="Calibri" w:hAnsi="Calibri"/>
-          <w:color w:val="1E293B"/>
-          <w:sz w:val="21"/>
-        </w:rPr>
-        <w:t xml:space="preserve"> (5 Stages, ~10–15s). Skips 30-MCQ online test calibration upfront, sanitizes state (</w:t>
+        <w:t>theme.py</w:t>
+      </w:r>
+      <w:r>
+        <w:rPr>
+          <w:rFonts w:ascii="Calibri" w:hAnsi="Calibri"/>
+          <w:color w:val="1E293B"/>
+          <w:sz w:val="21"/>
+        </w:rPr>
+        <w:t>), 40+ zero-dependency inline SVG vector icons (</w:t>
       </w:r>
       <w:r>
         <w:rPr>
@@ -5555,6 +5431,320 @@
           <w:color w:val="0F5182"/>
           <w:sz w:val="19"/>
         </w:rPr>
+        <w:t>icons.py</w:t>
+      </w:r>
+      <w:r>
+        <w:rPr>
+          <w:rFonts w:ascii="Calibri" w:hAnsi="Calibri"/>
+          <w:color w:val="1E293B"/>
+          <w:sz w:val="21"/>
+        </w:rPr>
+        <w:t>), decoupled UI component kit (</w:t>
+      </w:r>
+      <w:r>
+        <w:rPr>
+          <w:rFonts w:ascii="Consolas" w:hAnsi="Consolas"/>
+          <w:color w:val="0F5182"/>
+          <w:sz w:val="19"/>
+        </w:rPr>
+        <w:t>ui_kit.py</w:t>
+      </w:r>
+      <w:r>
+        <w:rPr>
+          <w:rFonts w:ascii="Calibri" w:hAnsi="Calibri"/>
+          <w:color w:val="1E293B"/>
+          <w:sz w:val="21"/>
+        </w:rPr>
+        <w:t>), clean hero headers without badge clutter, interactive stepper (</w:t>
+      </w:r>
+      <w:r>
+        <w:rPr>
+          <w:rFonts w:ascii="Consolas" w:hAnsi="Consolas"/>
+          <w:color w:val="0F5182"/>
+          <w:sz w:val="19"/>
+        </w:rPr>
+        <w:t>UI.stepper</w:t>
+      </w:r>
+      <w:r>
+        <w:rPr>
+          <w:rFonts w:ascii="Calibri" w:hAnsi="Calibri"/>
+          <w:color w:val="1E293B"/>
+          <w:sz w:val="21"/>
+        </w:rPr>
+        <w:t>), and high-contrast neumorphic glass aesthetics.</w:t>
+      </w:r>
+    </w:p>
+    <w:p>
+      <w:pPr>
+        <w:pStyle w:val="ListBullet"/>
+        <w:spacing w:before="20" w:after="40"/>
+      </w:pPr>
+      <w:r>
+        <w:rPr>
+          <w:rFonts w:ascii="Calibri" w:hAnsi="Calibri"/>
+          <w:b/>
+          <w:color w:val="0F172A"/>
+          <w:sz w:val="21"/>
+        </w:rPr>
+        <w:t>Advisory Disclaimer &amp; Terms of Use:</w:t>
+      </w:r>
+      <w:r>
+        <w:rPr>
+          <w:rFonts w:ascii="Calibri" w:hAnsi="Calibri"/>
+          <w:color w:val="1E293B"/>
+          <w:sz w:val="21"/>
+        </w:rPr>
+        <w:t xml:space="preserve"> Globally rendered executive card footer on all application views specifying probabilistic AI nature, possible errors/false outputs, use at own risk, and terms of use agreement.</w:t>
+      </w:r>
+    </w:p>
+    <w:p>
+      <w:pPr>
+        <w:pStyle w:val="ListBullet"/>
+        <w:spacing w:before="20" w:after="40"/>
+      </w:pPr>
+      <w:r>
+        <w:rPr>
+          <w:rFonts w:ascii="Calibri" w:hAnsi="Calibri"/>
+          <w:b/>
+          <w:color w:val="0F172A"/>
+          <w:sz w:val="21"/>
+        </w:rPr>
+        <w:t>Dynamic Model Auto-Discovery &amp; Zero 404 Guarantee:</w:t>
+      </w:r>
+      <w:r>
+        <w:rPr>
+          <w:rFonts w:ascii="Calibri" w:hAnsi="Calibri"/>
+          <w:color w:val="1E293B"/>
+          <w:sz w:val="21"/>
+        </w:rPr>
+        <w:t xml:space="preserve"> Active tiered cascade (</w:t>
+      </w:r>
+      <w:r>
+        <w:rPr>
+          <w:rFonts w:ascii="Consolas" w:hAnsi="Consolas"/>
+          <w:color w:val="0F5182"/>
+          <w:sz w:val="19"/>
+        </w:rPr>
+        <w:t>gemini-2.5-flash</w:t>
+      </w:r>
+      <w:r>
+        <w:rPr>
+          <w:rFonts w:ascii="Calibri" w:hAnsi="Calibri"/>
+          <w:color w:val="1E293B"/>
+          <w:sz w:val="21"/>
+        </w:rPr>
+        <w:t xml:space="preserve">, </w:t>
+      </w:r>
+      <w:r>
+        <w:rPr>
+          <w:rFonts w:ascii="Consolas" w:hAnsi="Consolas"/>
+          <w:color w:val="0F5182"/>
+          <w:sz w:val="19"/>
+        </w:rPr>
+        <w:t>gemini-flash-latest</w:t>
+      </w:r>
+      <w:r>
+        <w:rPr>
+          <w:rFonts w:ascii="Calibri" w:hAnsi="Calibri"/>
+          <w:color w:val="1E293B"/>
+          <w:sz w:val="21"/>
+        </w:rPr>
+        <w:t xml:space="preserve">, </w:t>
+      </w:r>
+      <w:r>
+        <w:rPr>
+          <w:rFonts w:ascii="Consolas" w:hAnsi="Consolas"/>
+          <w:color w:val="0F5182"/>
+          <w:sz w:val="19"/>
+        </w:rPr>
+        <w:t>gemini-3.8-flash</w:t>
+      </w:r>
+      <w:r>
+        <w:rPr>
+          <w:rFonts w:ascii="Calibri" w:hAnsi="Calibri"/>
+          <w:color w:val="1E293B"/>
+          <w:sz w:val="21"/>
+        </w:rPr>
+        <w:t>, etc.) with session blacklisting for 404s. Retired models (</w:t>
+      </w:r>
+      <w:r>
+        <w:rPr>
+          <w:rFonts w:ascii="Consolas" w:hAnsi="Consolas"/>
+          <w:color w:val="0F5182"/>
+          <w:sz w:val="19"/>
+        </w:rPr>
+        <w:t>gemini-pro</w:t>
+      </w:r>
+      <w:r>
+        <w:rPr>
+          <w:rFonts w:ascii="Calibri" w:hAnsi="Calibri"/>
+          <w:color w:val="1E293B"/>
+          <w:sz w:val="21"/>
+        </w:rPr>
+        <w:t xml:space="preserve">, </w:t>
+      </w:r>
+      <w:r>
+        <w:rPr>
+          <w:rFonts w:ascii="Consolas" w:hAnsi="Consolas"/>
+          <w:color w:val="0F5182"/>
+          <w:sz w:val="19"/>
+        </w:rPr>
+        <w:t>gemini-1.5-flash</w:t>
+      </w:r>
+      <w:r>
+        <w:rPr>
+          <w:rFonts w:ascii="Calibri" w:hAnsi="Calibri"/>
+          <w:color w:val="1E293B"/>
+          <w:sz w:val="21"/>
+        </w:rPr>
+        <w:t>) can never cause cascading crashes.</w:t>
+      </w:r>
+    </w:p>
+    <w:p>
+      <w:pPr>
+        <w:pStyle w:val="ListBullet"/>
+        <w:spacing w:before="20" w:after="40"/>
+      </w:pPr>
+      <w:r>
+        <w:rPr>
+          <w:rFonts w:ascii="Calibri" w:hAnsi="Calibri"/>
+          <w:b/>
+          <w:color w:val="0F172A"/>
+          <w:sz w:val="21"/>
+        </w:rPr>
+        <w:t>Output Quality Verification Engine:</w:t>
+      </w:r>
+      <w:r>
+        <w:rPr>
+          <w:rFonts w:ascii="Calibri" w:hAnsi="Calibri"/>
+          <w:color w:val="1E293B"/>
+          <w:sz w:val="21"/>
+        </w:rPr>
+        <w:t xml:space="preserve"> In-process Multi-Agent Quality Controller evaluates sub-agent deliverables (completeness, specificity, requirements matrix depth, 5-dimensional questions, option validity, and 48-hour study roadmap viability) and binds real-time quality badges to the executive UI.</w:t>
+      </w:r>
+    </w:p>
+    <w:p>
+      <w:pPr>
+        <w:pStyle w:val="ListBullet"/>
+        <w:spacing w:before="20" w:after="40"/>
+      </w:pPr>
+      <w:r>
+        <w:rPr>
+          <w:rFonts w:ascii="Calibri" w:hAnsi="Calibri"/>
+          <w:b/>
+          <w:color w:val="0F172A"/>
+          <w:sz w:val="21"/>
+        </w:rPr>
+        <w:t>Non-Blocking Telemetry:</w:t>
+      </w:r>
+      <w:r>
+        <w:rPr>
+          <w:rFonts w:ascii="Calibri" w:hAnsi="Calibri"/>
+          <w:color w:val="1E293B"/>
+          <w:sz w:val="21"/>
+        </w:rPr>
+        <w:t xml:space="preserve"> Atomic timestamp reservation rate pacer guarantees &lt;=12 RPM while releasing mutex lock before sleep, keeping Streamlit UI telemetry 100% non-blocking.</w:t>
+      </w:r>
+    </w:p>
+    <w:p>
+      <w:pPr>
+        <w:pStyle w:val="ListBullet"/>
+        <w:spacing w:before="20" w:after="40"/>
+      </w:pPr>
+      <w:r>
+        <w:rPr>
+          <w:rFonts w:ascii="Calibri" w:hAnsi="Calibri"/>
+          <w:b/>
+          <w:color w:val="0F172A"/>
+          <w:sz w:val="21"/>
+        </w:rPr>
+        <w:t>Reporting:</w:t>
+      </w:r>
+      <w:r>
+        <w:rPr>
+          <w:rFonts w:ascii="Calibri" w:hAnsi="Calibri"/>
+          <w:color w:val="1E293B"/>
+          <w:sz w:val="21"/>
+        </w:rPr>
+        <w:t xml:space="preserve"> Standalone 2-3 page Strategic Fit Report PDF (</w:t>
+      </w:r>
+      <w:r>
+        <w:rPr>
+          <w:rFonts w:ascii="Consolas" w:hAnsi="Consolas"/>
+          <w:color w:val="0F5182"/>
+          <w:sz w:val="19"/>
+        </w:rPr>
+        <w:t>generate_fit_report_pdf</w:t>
+      </w:r>
+      <w:r>
+        <w:rPr>
+          <w:rFonts w:ascii="Calibri" w:hAnsi="Calibri"/>
+          <w:color w:val="1E293B"/>
+          <w:sz w:val="21"/>
+        </w:rPr>
+        <w:t>) and full multi-step Dossier PDF available on Step 2.</w:t>
+      </w:r>
+    </w:p>
+    <w:p>
+      <w:pPr>
+        <w:pStyle w:val="ListBullet"/>
+        <w:spacing w:before="20" w:after="40"/>
+      </w:pPr>
+      <w:r>
+        <w:rPr>
+          <w:rFonts w:ascii="Calibri" w:hAnsi="Calibri"/>
+          <w:b/>
+          <w:color w:val="0F172A"/>
+          <w:sz w:val="21"/>
+        </w:rPr>
+        <w:t>Dual-Mode Candidate Onboarding:</w:t>
+      </w:r>
+    </w:p>
+    <w:p>
+      <w:pPr>
+        <w:pStyle w:val="ListBullet"/>
+        <w:spacing w:before="20" w:after="40"/>
+      </w:pPr>
+      <w:r>
+        <w:rPr>
+          <w:rFonts w:ascii="Calibri" w:hAnsi="Calibri"/>
+          <w:b/>
+          <w:color w:val="0F172A"/>
+          <w:sz w:val="21"/>
+        </w:rPr>
+        <w:t>Option 1 (Fast Track):</w:t>
+      </w:r>
+      <w:r>
+        <w:rPr>
+          <w:rFonts w:ascii="Calibri" w:hAnsi="Calibri"/>
+          <w:color w:val="1E293B"/>
+          <w:sz w:val="21"/>
+        </w:rPr>
+        <w:t xml:space="preserve"> </w:t>
+      </w:r>
+      <w:r>
+        <w:rPr>
+          <w:rFonts w:ascii="Calibri" w:hAnsi="Calibri"/>
+          <w:i/>
+          <w:color w:val="334155"/>
+          <w:sz w:val="21"/>
+        </w:rPr>
+        <w:t>Run Strategic Fit &amp; Question Bank Alone</w:t>
+      </w:r>
+      <w:r>
+        <w:rPr>
+          <w:rFonts w:ascii="Calibri" w:hAnsi="Calibri"/>
+          <w:color w:val="1E293B"/>
+          <w:sz w:val="21"/>
+        </w:rPr>
+        <w:t xml:space="preserve"> (5 Stages, ~10–15s). Skips 30-MCQ online test calibration upfront, sanitizes state (</w:t>
+      </w:r>
+      <w:r>
+        <w:rPr>
+          <w:rFonts w:ascii="Consolas" w:hAnsi="Consolas"/>
+          <w:color w:val="0F5182"/>
+          <w:sz w:val="19"/>
+        </w:rPr>
         <w:t>online_test = None</w:t>
       </w:r>
       <w:r>
@@ -6005,6 +6195,21 @@
     </w:p>
     <w:p>
       <w:pPr>
+        <w:pStyle w:val="ListBullet"/>
+        <w:spacing w:before="20" w:after="40"/>
+      </w:pPr>
+      <w:r>
+        <w:rPr>
+          <w:rFonts w:ascii="Calibri" w:hAnsi="Calibri"/>
+          <w:b/>
+          <w:color w:val="0F172A"/>
+          <w:sz w:val="21"/>
+        </w:rPr>
+        <w:t>Session #26 Accomplishments:</w:t>
+      </w:r>
+    </w:p>
+    <w:p>
+      <w:pPr>
         <w:pStyle w:val="ListNumber"/>
         <w:spacing w:before="20" w:after="40"/>
       </w:pPr>
@@ -6014,7 +6219,7 @@
           <w:color w:val="1E293B"/>
           <w:sz w:val="21"/>
         </w:rPr>
-        <w:t>Regenerated all 5 Microsoft Word (</w:t>
+        <w:t xml:space="preserve">Diagnosed GitHub Actions CI failure on commit </w:t>
       </w:r>
       <w:r>
         <w:rPr>
@@ -6022,15 +6227,15 @@
           <w:color w:val="0F5182"/>
           <w:sz w:val="19"/>
         </w:rPr>
-        <w:t>.docx</w:t>
-      </w:r>
-      <w:r>
-        <w:rPr>
-          <w:rFonts w:ascii="Calibri" w:hAnsi="Calibri"/>
-          <w:color w:val="1E293B"/>
-          <w:sz w:val="21"/>
-        </w:rPr>
-        <w:t xml:space="preserve">) manuals in </w:t>
+        <w:t>8f5cf89</w:t>
+      </w:r>
+      <w:r>
+        <w:rPr>
+          <w:rFonts w:ascii="Calibri" w:hAnsi="Calibri"/>
+          <w:color w:val="1E293B"/>
+          <w:sz w:val="21"/>
+        </w:rPr>
+        <w:t xml:space="preserve"> caused by static </w:t>
       </w:r>
       <w:r>
         <w:rPr>
@@ -6038,6 +6243,316 @@
           <w:color w:val="0F5182"/>
           <w:sz w:val="19"/>
         </w:rPr>
+        <w:t>py_compile</w:t>
+      </w:r>
+      <w:r>
+        <w:rPr>
+          <w:rFonts w:ascii="Calibri" w:hAnsi="Calibri"/>
+          <w:color w:val="1E293B"/>
+          <w:sz w:val="21"/>
+        </w:rPr>
+        <w:t xml:space="preserve"> calls on 3 deleted pruned modules (</w:t>
+      </w:r>
+      <w:r>
+        <w:rPr>
+          <w:rFonts w:ascii="Consolas" w:hAnsi="Consolas"/>
+          <w:color w:val="0F5182"/>
+          <w:sz w:val="19"/>
+        </w:rPr>
+        <w:t>case_study_agent.py</w:t>
+      </w:r>
+      <w:r>
+        <w:rPr>
+          <w:rFonts w:ascii="Calibri" w:hAnsi="Calibri"/>
+          <w:color w:val="1E293B"/>
+          <w:sz w:val="21"/>
+        </w:rPr>
+        <w:t xml:space="preserve">, </w:t>
+      </w:r>
+      <w:r>
+        <w:rPr>
+          <w:rFonts w:ascii="Consolas" w:hAnsi="Consolas"/>
+          <w:color w:val="0F5182"/>
+          <w:sz w:val="19"/>
+        </w:rPr>
+        <w:t>compensation_negotiator.py</w:t>
+      </w:r>
+      <w:r>
+        <w:rPr>
+          <w:rFonts w:ascii="Calibri" w:hAnsi="Calibri"/>
+          <w:color w:val="1E293B"/>
+          <w:sz w:val="21"/>
+        </w:rPr>
+        <w:t xml:space="preserve">, </w:t>
+      </w:r>
+      <w:r>
+        <w:rPr>
+          <w:rFonts w:ascii="Consolas" w:hAnsi="Consolas"/>
+          <w:color w:val="0F5182"/>
+          <w:sz w:val="19"/>
+        </w:rPr>
+        <w:t>cohort_analyzer.py</w:t>
+      </w:r>
+      <w:r>
+        <w:rPr>
+          <w:rFonts w:ascii="Calibri" w:hAnsi="Calibri"/>
+          <w:color w:val="1E293B"/>
+          <w:sz w:val="21"/>
+        </w:rPr>
+        <w:t>).</w:t>
+      </w:r>
+    </w:p>
+    <w:p>
+      <w:pPr>
+        <w:pStyle w:val="ListNumber"/>
+        <w:spacing w:before="20" w:after="40"/>
+      </w:pPr>
+      <w:r>
+        <w:rPr>
+          <w:rFonts w:ascii="Calibri" w:hAnsi="Calibri"/>
+          <w:color w:val="1E293B"/>
+          <w:sz w:val="21"/>
+        </w:rPr>
+        <w:t xml:space="preserve">Modernized </w:t>
+      </w:r>
+      <w:r>
+        <w:rPr>
+          <w:rFonts w:ascii="Consolas" w:hAnsi="Consolas"/>
+          <w:color w:val="0F5182"/>
+          <w:sz w:val="19"/>
+        </w:rPr>
+        <w:t>.github/workflows/ci.yml</w:t>
+      </w:r>
+      <w:r>
+        <w:rPr>
+          <w:rFonts w:ascii="Calibri" w:hAnsi="Calibri"/>
+          <w:color w:val="1E293B"/>
+          <w:sz w:val="21"/>
+        </w:rPr>
+        <w:t xml:space="preserve"> with recursive bytecode compilation via </w:t>
+      </w:r>
+      <w:r>
+        <w:rPr>
+          <w:rFonts w:ascii="Consolas" w:hAnsi="Consolas"/>
+          <w:color w:val="0F5182"/>
+          <w:sz w:val="19"/>
+        </w:rPr>
+        <w:t>compileall</w:t>
+      </w:r>
+      <w:r>
+        <w:rPr>
+          <w:rFonts w:ascii="Calibri" w:hAnsi="Calibri"/>
+          <w:color w:val="1E293B"/>
+          <w:sz w:val="21"/>
+        </w:rPr>
+        <w:t>, manual workflow dispatch, concurrency controls, and headless Linux environment variables.</w:t>
+      </w:r>
+    </w:p>
+    <w:p>
+      <w:pPr>
+        <w:pStyle w:val="ListNumber"/>
+        <w:spacing w:before="20" w:after="40"/>
+      </w:pPr>
+      <w:r>
+        <w:rPr>
+          <w:rFonts w:ascii="Calibri" w:hAnsi="Calibri"/>
+          <w:color w:val="1E293B"/>
+          <w:sz w:val="21"/>
+        </w:rPr>
+        <w:t xml:space="preserve">Hardened </w:t>
+      </w:r>
+      <w:r>
+        <w:rPr>
+          <w:rFonts w:ascii="Consolas" w:hAnsi="Consolas"/>
+          <w:color w:val="0F5182"/>
+          <w:sz w:val="19"/>
+        </w:rPr>
+        <w:t>.dockerignore</w:t>
+      </w:r>
+      <w:r>
+        <w:rPr>
+          <w:rFonts w:ascii="Calibri" w:hAnsi="Calibri"/>
+          <w:color w:val="1E293B"/>
+          <w:sz w:val="21"/>
+        </w:rPr>
+        <w:t xml:space="preserve"> to strictly prevent baking </w:t>
+      </w:r>
+      <w:r>
+        <w:rPr>
+          <w:rFonts w:ascii="Consolas" w:hAnsi="Consolas"/>
+          <w:color w:val="0F5182"/>
+          <w:sz w:val="19"/>
+        </w:rPr>
+        <w:t>.env</w:t>
+      </w:r>
+      <w:r>
+        <w:rPr>
+          <w:rFonts w:ascii="Calibri" w:hAnsi="Calibri"/>
+          <w:color w:val="1E293B"/>
+          <w:sz w:val="21"/>
+        </w:rPr>
+        <w:t>, SQLite databases, and candidate session JSON files into container layers.</w:t>
+      </w:r>
+    </w:p>
+    <w:p>
+      <w:pPr>
+        <w:pStyle w:val="ListNumber"/>
+        <w:spacing w:before="20" w:after="40"/>
+      </w:pPr>
+      <w:r>
+        <w:rPr>
+          <w:rFonts w:ascii="Calibri" w:hAnsi="Calibri"/>
+          <w:color w:val="1E293B"/>
+          <w:sz w:val="21"/>
+        </w:rPr>
+        <w:t xml:space="preserve">Hardened </w:t>
+      </w:r>
+      <w:r>
+        <w:rPr>
+          <w:rFonts w:ascii="Consolas" w:hAnsi="Consolas"/>
+          <w:color w:val="0F5182"/>
+          <w:sz w:val="19"/>
+        </w:rPr>
+        <w:t>Dockerfile</w:t>
+      </w:r>
+      <w:r>
+        <w:rPr>
+          <w:rFonts w:ascii="Calibri" w:hAnsi="Calibri"/>
+          <w:color w:val="1E293B"/>
+          <w:sz w:val="21"/>
+        </w:rPr>
+        <w:t xml:space="preserve"> with non-root security (</w:t>
+      </w:r>
+      <w:r>
+        <w:rPr>
+          <w:rFonts w:ascii="Consolas" w:hAnsi="Consolas"/>
+          <w:color w:val="0F5182"/>
+          <w:sz w:val="19"/>
+        </w:rPr>
+        <w:t>appuser</w:t>
+      </w:r>
+      <w:r>
+        <w:rPr>
+          <w:rFonts w:ascii="Calibri" w:hAnsi="Calibri"/>
+          <w:color w:val="1E293B"/>
+          <w:sz w:val="21"/>
+        </w:rPr>
+        <w:t xml:space="preserve">, UID 1000), </w:t>
+      </w:r>
+      <w:r>
+        <w:rPr>
+          <w:rFonts w:ascii="Consolas" w:hAnsi="Consolas"/>
+          <w:color w:val="0F5182"/>
+          <w:sz w:val="19"/>
+        </w:rPr>
+        <w:t>ffmpeg</w:t>
+      </w:r>
+      <w:r>
+        <w:rPr>
+          <w:rFonts w:ascii="Calibri" w:hAnsi="Calibri"/>
+          <w:color w:val="1E293B"/>
+          <w:sz w:val="21"/>
+        </w:rPr>
+        <w:t>, and layer optimization.</w:t>
+      </w:r>
+    </w:p>
+    <w:p>
+      <w:pPr>
+        <w:pStyle w:val="ListNumber"/>
+        <w:spacing w:before="20" w:after="40"/>
+      </w:pPr>
+      <w:r>
+        <w:rPr>
+          <w:rFonts w:ascii="Calibri" w:hAnsi="Calibri"/>
+          <w:color w:val="1E293B"/>
+          <w:sz w:val="21"/>
+        </w:rPr>
+        <w:t xml:space="preserve">Modernized </w:t>
+      </w:r>
+      <w:r>
+        <w:rPr>
+          <w:rFonts w:ascii="Consolas" w:hAnsi="Consolas"/>
+          <w:color w:val="0F5182"/>
+          <w:sz w:val="19"/>
+        </w:rPr>
+        <w:t>deploy.sh</w:t>
+      </w:r>
+      <w:r>
+        <w:rPr>
+          <w:rFonts w:ascii="Calibri" w:hAnsi="Calibri"/>
+          <w:color w:val="1E293B"/>
+          <w:sz w:val="21"/>
+        </w:rPr>
+        <w:t xml:space="preserve">, </w:t>
+      </w:r>
+      <w:r>
+        <w:rPr>
+          <w:rFonts w:ascii="Consolas" w:hAnsi="Consolas"/>
+          <w:color w:val="0F5182"/>
+          <w:sz w:val="19"/>
+        </w:rPr>
+        <w:t>deploy.bat</w:t>
+      </w:r>
+      <w:r>
+        <w:rPr>
+          <w:rFonts w:ascii="Calibri" w:hAnsi="Calibri"/>
+          <w:color w:val="1E293B"/>
+          <w:sz w:val="21"/>
+        </w:rPr>
+        <w:t xml:space="preserve">, and </w:t>
+      </w:r>
+      <w:r>
+        <w:rPr>
+          <w:rFonts w:ascii="Consolas" w:hAnsi="Consolas"/>
+          <w:color w:val="0F5182"/>
+          <w:sz w:val="19"/>
+        </w:rPr>
+        <w:t>deploy_hf.bat</w:t>
+      </w:r>
+      <w:r>
+        <w:rPr>
+          <w:rFonts w:ascii="Calibri" w:hAnsi="Calibri"/>
+          <w:color w:val="1E293B"/>
+          <w:sz w:val="21"/>
+        </w:rPr>
+        <w:t xml:space="preserve"> with dual Docker Compose detection and pre-flight checks.</w:t>
+      </w:r>
+    </w:p>
+    <w:p>
+      <w:pPr>
+        <w:pStyle w:val="ListNumber"/>
+        <w:spacing w:before="20" w:after="40"/>
+      </w:pPr>
+      <w:r>
+        <w:rPr>
+          <w:rFonts w:ascii="Calibri" w:hAnsi="Calibri"/>
+          <w:color w:val="1E293B"/>
+          <w:sz w:val="21"/>
+        </w:rPr>
+        <w:t>Rebuilt all 5 executive Microsoft Word (</w:t>
+      </w:r>
+      <w:r>
+        <w:rPr>
+          <w:rFonts w:ascii="Consolas" w:hAnsi="Consolas"/>
+          <w:color w:val="0F5182"/>
+          <w:sz w:val="19"/>
+        </w:rPr>
+        <w:t>.docx</w:t>
+      </w:r>
+      <w:r>
+        <w:rPr>
+          <w:rFonts w:ascii="Calibri" w:hAnsi="Calibri"/>
+          <w:color w:val="1E293B"/>
+          <w:sz w:val="21"/>
+        </w:rPr>
+        <w:t xml:space="preserve">) dossiers in </w:t>
+      </w:r>
+      <w:r>
+        <w:rPr>
+          <w:rFonts w:ascii="Consolas" w:hAnsi="Consolas"/>
+          <w:color w:val="0F5182"/>
+          <w:sz w:val="19"/>
+        </w:rPr>
         <w:t>/docs</w:t>
       </w:r>
       <w:r>
@@ -6083,7 +6598,7 @@
           <w:color w:val="1E293B"/>
           <w:sz w:val="21"/>
         </w:rPr>
-        <w:t xml:space="preserve"> GitHub push protection secret violations fully resolved, developer attribution card integrated, and zero-leak security audit verified.</w:t>
+        <w:t xml:space="preserve"> GitHub Actions CI failure eradicated, container security hardened, and deployment scripts modernized.</w:t>
       </w:r>
     </w:p>
     <w:p>
@@ -6106,7 +6621,7 @@
           <w:color w:val="1E293B"/>
           <w:sz w:val="21"/>
         </w:rPr>
-        <w:t xml:space="preserve"> 100% test pass rate across all test suites with zero regressions.</w:t>
+        <w:t xml:space="preserve"> 100% test pass rate across all 101 tests in 26.65s with zero regressions.</w:t>
       </w:r>
     </w:p>
     <w:p>

</xml_diff>

<commit_message>
docs: synchronize project logs, status, KT documentation, and add GitHub deployment strategy guide
</commit_message>
<xml_diff>
--- a/docs/KT_DOCUMENT.docx
+++ b/docs/KT_DOCUMENT.docx
@@ -5052,7 +5052,7 @@
           <w:color w:val="1E293B"/>
           <w:sz w:val="21"/>
         </w:rPr>
-        <w:t xml:space="preserve"> All 29 phases completed and verified live (Phases 0 through 25H), Session #20 Dual Onboarding Modes, Session #21 Multi-Model Cascade Modernization, Session #22 Multi-Subagent Output Quality Verification Engine, Session #23 Header Badges Removal &amp; Advisory Terms Disclaimer, Session #24 Local Key Persistence Removal, Session #25 GitHub Push Protection Secret Remediation &amp; Developer Attribution, and Session #26 GitHub Actions CI Pipeline Resolution &amp; Production Hardening.</w:t>
+        <w:t xml:space="preserve"> All 30 phases completed and verified live (Phases 0 through 25I), Session #20 Dual Onboarding Modes, Session #21 Multi-Model Cascade Modernization, Session #22 Multi-Subagent Output Quality Verification Engine, Session #23 Header Badges Removal &amp; Advisory Terms Disclaimer, Session #24 Local Key Persistence Removal, Session #25 GitHub Push Protection Secret Remediation &amp; Developer Attribution, Session #26 GitHub Actions CI Pipeline Resolution &amp; Production Hardening, and Session #27 Streamlit Community Cloud Hosting Deployment.</w:t>
       </w:r>
     </w:p>
     <w:p>
@@ -5084,7 +5084,7 @@
           <w:color w:val="0F172A"/>
           <w:sz w:val="21"/>
         </w:rPr>
-        <w:t>101 of 101 unit, integration, and Streamlit UAT tests passing cleanly (100% pass rate in 26.65s)</w:t>
+        <w:t>101 of 101 unit, integration, and Streamlit UAT tests passing cleanly (100% pass rate in 22.5s)</w:t>
       </w:r>
       <w:r>
         <w:rPr>
@@ -5233,15 +5233,15 @@
           <w:color w:val="0F172A"/>
           <w:sz w:val="21"/>
         </w:rPr>
-        <w:t>Production Containerization:</w:t>
-      </w:r>
-      <w:r>
-        <w:rPr>
-          <w:rFonts w:ascii="Calibri" w:hAnsi="Calibri"/>
-          <w:color w:val="1E293B"/>
-          <w:sz w:val="21"/>
-        </w:rPr>
-        <w:t xml:space="preserve"> Hardened </w:t>
+        <w:t>Hosting Readiness:</w:t>
+      </w:r>
+      <w:r>
+        <w:rPr>
+          <w:rFonts w:ascii="Calibri" w:hAnsi="Calibri"/>
+          <w:color w:val="1E293B"/>
+          <w:sz w:val="21"/>
+        </w:rPr>
+        <w:t xml:space="preserve"> Dual entrypoints (</w:t>
       </w:r>
       <w:r>
         <w:rPr>
@@ -5249,15 +5249,15 @@
           <w:color w:val="0F5182"/>
           <w:sz w:val="19"/>
         </w:rPr>
-        <w:t>Dockerfile</w:t>
-      </w:r>
-      <w:r>
-        <w:rPr>
-          <w:rFonts w:ascii="Calibri" w:hAnsi="Calibri"/>
-          <w:color w:val="1E293B"/>
-          <w:sz w:val="21"/>
-        </w:rPr>
-        <w:t xml:space="preserve"> with non-root security (</w:t>
+        <w:t>frontend/app.py</w:t>
+      </w:r>
+      <w:r>
+        <w:rPr>
+          <w:rFonts w:ascii="Calibri" w:hAnsi="Calibri"/>
+          <w:color w:val="1E293B"/>
+          <w:sz w:val="21"/>
+        </w:rPr>
+        <w:t xml:space="preserve"> and </w:t>
       </w:r>
       <w:r>
         <w:rPr>
@@ -5265,15 +5265,15 @@
           <w:color w:val="0F5182"/>
           <w:sz w:val="19"/>
         </w:rPr>
-        <w:t>appuser</w:t>
-      </w:r>
-      <w:r>
-        <w:rPr>
-          <w:rFonts w:ascii="Calibri" w:hAnsi="Calibri"/>
-          <w:color w:val="1E293B"/>
-          <w:sz w:val="21"/>
-        </w:rPr>
-        <w:t xml:space="preserve">, UID 1000), </w:t>
+        <w:t>streamlit_app.py</w:t>
+      </w:r>
+      <w:r>
+        <w:rPr>
+          <w:rFonts w:ascii="Calibri" w:hAnsi="Calibri"/>
+          <w:color w:val="1E293B"/>
+          <w:sz w:val="21"/>
+        </w:rPr>
+        <w:t xml:space="preserve">) live on GitHub </w:t>
       </w:r>
       <w:r>
         <w:rPr>
@@ -5281,15 +5281,38 @@
           <w:color w:val="0F5182"/>
           <w:sz w:val="19"/>
         </w:rPr>
-        <w:t>ffmpeg</w:t>
-      </w:r>
-      <w:r>
-        <w:rPr>
-          <w:rFonts w:ascii="Calibri" w:hAnsi="Calibri"/>
-          <w:color w:val="1E293B"/>
-          <w:sz w:val="21"/>
-        </w:rPr>
-        <w:t xml:space="preserve"> installation, and lean build layers; fortified </w:t>
+        <w:t>main</w:t>
+      </w:r>
+      <w:r>
+        <w:rPr>
+          <w:rFonts w:ascii="Calibri" w:hAnsi="Calibri"/>
+          <w:color w:val="1E293B"/>
+          <w:sz w:val="21"/>
+        </w:rPr>
+        <w:t xml:space="preserve"> branch. Tested and compatible with Streamlit Community Cloud, Hugging Face Spaces, and Docker.</w:t>
+      </w:r>
+    </w:p>
+    <w:p>
+      <w:pPr>
+        <w:pStyle w:val="ListBullet"/>
+        <w:spacing w:before="20" w:after="40"/>
+      </w:pPr>
+      <w:r>
+        <w:rPr>
+          <w:rFonts w:ascii="Calibri" w:hAnsi="Calibri"/>
+          <w:b/>
+          <w:color w:val="0F172A"/>
+          <w:sz w:val="21"/>
+        </w:rPr>
+        <w:t>Production Containerization:</w:t>
+      </w:r>
+      <w:r>
+        <w:rPr>
+          <w:rFonts w:ascii="Calibri" w:hAnsi="Calibri"/>
+          <w:color w:val="1E293B"/>
+          <w:sz w:val="21"/>
+        </w:rPr>
+        <w:t xml:space="preserve"> Hardened </w:t>
       </w:r>
       <w:r>
         <w:rPr>
@@ -5297,15 +5320,15 @@
           <w:color w:val="0F5182"/>
           <w:sz w:val="19"/>
         </w:rPr>
-        <w:t>.dockerignore</w:t>
-      </w:r>
-      <w:r>
-        <w:rPr>
-          <w:rFonts w:ascii="Calibri" w:hAnsi="Calibri"/>
-          <w:color w:val="1E293B"/>
-          <w:sz w:val="21"/>
-        </w:rPr>
-        <w:t xml:space="preserve"> blocking </w:t>
+        <w:t>Dockerfile</w:t>
+      </w:r>
+      <w:r>
+        <w:rPr>
+          <w:rFonts w:ascii="Calibri" w:hAnsi="Calibri"/>
+          <w:color w:val="1E293B"/>
+          <w:sz w:val="21"/>
+        </w:rPr>
+        <w:t xml:space="preserve"> with non-root security (</w:t>
       </w:r>
       <w:r>
         <w:rPr>
@@ -5313,101 +5336,15 @@
           <w:color w:val="0F5182"/>
           <w:sz w:val="19"/>
         </w:rPr>
-        <w:t>.env</w:t>
-      </w:r>
-      <w:r>
-        <w:rPr>
-          <w:rFonts w:ascii="Calibri" w:hAnsi="Calibri"/>
-          <w:color w:val="1E293B"/>
-          <w:sz w:val="21"/>
-        </w:rPr>
-        <w:t>, SQLite databases, and candidate session JSON files.</w:t>
-      </w:r>
-    </w:p>
-    <w:p>
-      <w:pPr>
-        <w:pStyle w:val="ListBullet"/>
-        <w:spacing w:before="20" w:after="40"/>
-      </w:pPr>
-      <w:r>
-        <w:rPr>
-          <w:rFonts w:ascii="Calibri" w:hAnsi="Calibri"/>
-          <w:b/>
-          <w:color w:val="0F172A"/>
-          <w:sz w:val="21"/>
-        </w:rPr>
-        <w:t>Developer Attribution:</w:t>
-      </w:r>
-      <w:r>
-        <w:rPr>
-          <w:rFonts w:ascii="Calibri" w:hAnsi="Calibri"/>
-          <w:color w:val="1E293B"/>
-          <w:sz w:val="21"/>
-        </w:rPr>
-        <w:t xml:space="preserve"> Executive card rendered across application views: </w:t>
-      </w:r>
-      <w:r>
-        <w:rPr>
-          <w:rFonts w:ascii="Calibri" w:hAnsi="Calibri"/>
-          <w:i/>
-          <w:color w:val="334155"/>
-          <w:sz w:val="21"/>
-        </w:rPr>
-        <w:t>"Developed by your frd Nitish and Jeevana"</w:t>
-      </w:r>
-      <w:r>
-        <w:rPr>
-          <w:rFonts w:ascii="Calibri" w:hAnsi="Calibri"/>
-          <w:color w:val="1E293B"/>
-          <w:sz w:val="21"/>
-        </w:rPr>
-        <w:t>.</w:t>
-      </w:r>
-    </w:p>
-    <w:p>
-      <w:pPr>
-        <w:pStyle w:val="ListBullet"/>
-        <w:spacing w:before="20" w:after="40"/>
-      </w:pPr>
-      <w:r>
-        <w:rPr>
-          <w:rFonts w:ascii="Calibri" w:hAnsi="Calibri"/>
-          <w:b/>
-          <w:color w:val="0F172A"/>
-          <w:sz w:val="21"/>
-        </w:rPr>
-        <w:t>Stability:</w:t>
-      </w:r>
-      <w:r>
-        <w:rPr>
-          <w:rFonts w:ascii="Calibri" w:hAnsi="Calibri"/>
-          <w:color w:val="1E293B"/>
-          <w:sz w:val="21"/>
-        </w:rPr>
-        <w:t xml:space="preserve"> 100% demo uptime guaranteed via rate pacing, two-tier caching, dynamic discovery, session 404 blacklisting, and deterministic failsafe fallback synthesis across all upstream agents.</w:t>
-      </w:r>
-    </w:p>
-    <w:p>
-      <w:pPr>
-        <w:pStyle w:val="ListBullet"/>
-        <w:spacing w:before="20" w:after="40"/>
-      </w:pPr>
-      <w:r>
-        <w:rPr>
-          <w:rFonts w:ascii="Calibri" w:hAnsi="Calibri"/>
-          <w:b/>
-          <w:color w:val="0F172A"/>
-          <w:sz w:val="21"/>
-        </w:rPr>
-        <w:t>Design System:</w:t>
-      </w:r>
-      <w:r>
-        <w:rPr>
-          <w:rFonts w:ascii="Calibri" w:hAnsi="Calibri"/>
-          <w:color w:val="1E293B"/>
-          <w:sz w:val="21"/>
-        </w:rPr>
-        <w:t xml:space="preserve"> Centralized Theme tokens (</w:t>
+        <w:t>appuser</w:t>
+      </w:r>
+      <w:r>
+        <w:rPr>
+          <w:rFonts w:ascii="Calibri" w:hAnsi="Calibri"/>
+          <w:color w:val="1E293B"/>
+          <w:sz w:val="21"/>
+        </w:rPr>
+        <w:t xml:space="preserve">, UID 1000), </w:t>
       </w:r>
       <w:r>
         <w:rPr>
@@ -5415,15 +5352,15 @@
           <w:color w:val="0F5182"/>
           <w:sz w:val="19"/>
         </w:rPr>
-        <w:t>theme.py</w:t>
-      </w:r>
-      <w:r>
-        <w:rPr>
-          <w:rFonts w:ascii="Calibri" w:hAnsi="Calibri"/>
-          <w:color w:val="1E293B"/>
-          <w:sz w:val="21"/>
-        </w:rPr>
-        <w:t>), 40+ zero-dependency inline SVG vector icons (</w:t>
+        <w:t>ffmpeg</w:t>
+      </w:r>
+      <w:r>
+        <w:rPr>
+          <w:rFonts w:ascii="Calibri" w:hAnsi="Calibri"/>
+          <w:color w:val="1E293B"/>
+          <w:sz w:val="21"/>
+        </w:rPr>
+        <w:t xml:space="preserve"> installation, and lean build layers; fortified </w:t>
       </w:r>
       <w:r>
         <w:rPr>
@@ -5431,15 +5368,15 @@
           <w:color w:val="0F5182"/>
           <w:sz w:val="19"/>
         </w:rPr>
-        <w:t>icons.py</w:t>
-      </w:r>
-      <w:r>
-        <w:rPr>
-          <w:rFonts w:ascii="Calibri" w:hAnsi="Calibri"/>
-          <w:color w:val="1E293B"/>
-          <w:sz w:val="21"/>
-        </w:rPr>
-        <w:t>), decoupled UI component kit (</w:t>
+        <w:t>.dockerignore</w:t>
+      </w:r>
+      <w:r>
+        <w:rPr>
+          <w:rFonts w:ascii="Calibri" w:hAnsi="Calibri"/>
+          <w:color w:val="1E293B"/>
+          <w:sz w:val="21"/>
+        </w:rPr>
+        <w:t xml:space="preserve"> blocking </w:t>
       </w:r>
       <w:r>
         <w:rPr>
@@ -5447,15 +5384,101 @@
           <w:color w:val="0F5182"/>
           <w:sz w:val="19"/>
         </w:rPr>
-        <w:t>ui_kit.py</w:t>
-      </w:r>
-      <w:r>
-        <w:rPr>
-          <w:rFonts w:ascii="Calibri" w:hAnsi="Calibri"/>
-          <w:color w:val="1E293B"/>
-          <w:sz w:val="21"/>
-        </w:rPr>
-        <w:t>), clean hero headers without badge clutter, interactive stepper (</w:t>
+        <w:t>.env</w:t>
+      </w:r>
+      <w:r>
+        <w:rPr>
+          <w:rFonts w:ascii="Calibri" w:hAnsi="Calibri"/>
+          <w:color w:val="1E293B"/>
+          <w:sz w:val="21"/>
+        </w:rPr>
+        <w:t>, SQLite databases, and candidate session JSON files.</w:t>
+      </w:r>
+    </w:p>
+    <w:p>
+      <w:pPr>
+        <w:pStyle w:val="ListBullet"/>
+        <w:spacing w:before="20" w:after="40"/>
+      </w:pPr>
+      <w:r>
+        <w:rPr>
+          <w:rFonts w:ascii="Calibri" w:hAnsi="Calibri"/>
+          <w:b/>
+          <w:color w:val="0F172A"/>
+          <w:sz w:val="21"/>
+        </w:rPr>
+        <w:t>Developer Attribution:</w:t>
+      </w:r>
+      <w:r>
+        <w:rPr>
+          <w:rFonts w:ascii="Calibri" w:hAnsi="Calibri"/>
+          <w:color w:val="1E293B"/>
+          <w:sz w:val="21"/>
+        </w:rPr>
+        <w:t xml:space="preserve"> Executive card rendered across application views: </w:t>
+      </w:r>
+      <w:r>
+        <w:rPr>
+          <w:rFonts w:ascii="Calibri" w:hAnsi="Calibri"/>
+          <w:i/>
+          <w:color w:val="334155"/>
+          <w:sz w:val="21"/>
+        </w:rPr>
+        <w:t>"Developed by your frd Nitish and Jeevana"</w:t>
+      </w:r>
+      <w:r>
+        <w:rPr>
+          <w:rFonts w:ascii="Calibri" w:hAnsi="Calibri"/>
+          <w:color w:val="1E293B"/>
+          <w:sz w:val="21"/>
+        </w:rPr>
+        <w:t>.</w:t>
+      </w:r>
+    </w:p>
+    <w:p>
+      <w:pPr>
+        <w:pStyle w:val="ListBullet"/>
+        <w:spacing w:before="20" w:after="40"/>
+      </w:pPr>
+      <w:r>
+        <w:rPr>
+          <w:rFonts w:ascii="Calibri" w:hAnsi="Calibri"/>
+          <w:b/>
+          <w:color w:val="0F172A"/>
+          <w:sz w:val="21"/>
+        </w:rPr>
+        <w:t>Stability:</w:t>
+      </w:r>
+      <w:r>
+        <w:rPr>
+          <w:rFonts w:ascii="Calibri" w:hAnsi="Calibri"/>
+          <w:color w:val="1E293B"/>
+          <w:sz w:val="21"/>
+        </w:rPr>
+        <w:t xml:space="preserve"> 100% demo uptime guaranteed via rate pacing, two-tier caching, dynamic discovery, session 404 blacklisting, and deterministic failsafe fallback synthesis across all upstream agents.</w:t>
+      </w:r>
+    </w:p>
+    <w:p>
+      <w:pPr>
+        <w:pStyle w:val="ListBullet"/>
+        <w:spacing w:before="20" w:after="40"/>
+      </w:pPr>
+      <w:r>
+        <w:rPr>
+          <w:rFonts w:ascii="Calibri" w:hAnsi="Calibri"/>
+          <w:b/>
+          <w:color w:val="0F172A"/>
+          <w:sz w:val="21"/>
+        </w:rPr>
+        <w:t>Design System:</w:t>
+      </w:r>
+      <w:r>
+        <w:rPr>
+          <w:rFonts w:ascii="Calibri" w:hAnsi="Calibri"/>
+          <w:color w:val="1E293B"/>
+          <w:sz w:val="21"/>
+        </w:rPr>
+        <w:t xml:space="preserve"> Centralized Theme tokens (</w:t>
       </w:r>
       <w:r>
         <w:rPr>
@@ -5463,61 +5486,15 @@
           <w:color w:val="0F5182"/>
           <w:sz w:val="19"/>
         </w:rPr>
-        <w:t>UI.stepper</w:t>
-      </w:r>
-      <w:r>
-        <w:rPr>
-          <w:rFonts w:ascii="Calibri" w:hAnsi="Calibri"/>
-          <w:color w:val="1E293B"/>
-          <w:sz w:val="21"/>
-        </w:rPr>
-        <w:t>), and high-contrast neumorphic glass aesthetics.</w:t>
-      </w:r>
-    </w:p>
-    <w:p>
-      <w:pPr>
-        <w:pStyle w:val="ListBullet"/>
-        <w:spacing w:before="20" w:after="40"/>
-      </w:pPr>
-      <w:r>
-        <w:rPr>
-          <w:rFonts w:ascii="Calibri" w:hAnsi="Calibri"/>
-          <w:b/>
-          <w:color w:val="0F172A"/>
-          <w:sz w:val="21"/>
-        </w:rPr>
-        <w:t>Advisory Disclaimer &amp; Terms of Use:</w:t>
-      </w:r>
-      <w:r>
-        <w:rPr>
-          <w:rFonts w:ascii="Calibri" w:hAnsi="Calibri"/>
-          <w:color w:val="1E293B"/>
-          <w:sz w:val="21"/>
-        </w:rPr>
-        <w:t xml:space="preserve"> Globally rendered executive card footer on all application views specifying probabilistic AI nature, possible errors/false outputs, use at own risk, and terms of use agreement.</w:t>
-      </w:r>
-    </w:p>
-    <w:p>
-      <w:pPr>
-        <w:pStyle w:val="ListBullet"/>
-        <w:spacing w:before="20" w:after="40"/>
-      </w:pPr>
-      <w:r>
-        <w:rPr>
-          <w:rFonts w:ascii="Calibri" w:hAnsi="Calibri"/>
-          <w:b/>
-          <w:color w:val="0F172A"/>
-          <w:sz w:val="21"/>
-        </w:rPr>
-        <w:t>Dynamic Model Auto-Discovery &amp; Zero 404 Guarantee:</w:t>
-      </w:r>
-      <w:r>
-        <w:rPr>
-          <w:rFonts w:ascii="Calibri" w:hAnsi="Calibri"/>
-          <w:color w:val="1E293B"/>
-          <w:sz w:val="21"/>
-        </w:rPr>
-        <w:t xml:space="preserve"> Active tiered cascade (</w:t>
+        <w:t>theme.py</w:t>
+      </w:r>
+      <w:r>
+        <w:rPr>
+          <w:rFonts w:ascii="Calibri" w:hAnsi="Calibri"/>
+          <w:color w:val="1E293B"/>
+          <w:sz w:val="21"/>
+        </w:rPr>
+        <w:t>), 40+ zero-dependency inline SVG vector icons (</w:t>
       </w:r>
       <w:r>
         <w:rPr>
@@ -5525,15 +5502,15 @@
           <w:color w:val="0F5182"/>
           <w:sz w:val="19"/>
         </w:rPr>
-        <w:t>gemini-2.5-flash</w:t>
-      </w:r>
-      <w:r>
-        <w:rPr>
-          <w:rFonts w:ascii="Calibri" w:hAnsi="Calibri"/>
-          <w:color w:val="1E293B"/>
-          <w:sz w:val="21"/>
-        </w:rPr>
-        <w:t xml:space="preserve">, </w:t>
+        <w:t>icons.py</w:t>
+      </w:r>
+      <w:r>
+        <w:rPr>
+          <w:rFonts w:ascii="Calibri" w:hAnsi="Calibri"/>
+          <w:color w:val="1E293B"/>
+          <w:sz w:val="21"/>
+        </w:rPr>
+        <w:t>), decoupled UI component kit (</w:t>
       </w:r>
       <w:r>
         <w:rPr>
@@ -5541,15 +5518,15 @@
           <w:color w:val="0F5182"/>
           <w:sz w:val="19"/>
         </w:rPr>
-        <w:t>gemini-flash-latest</w:t>
-      </w:r>
-      <w:r>
-        <w:rPr>
-          <w:rFonts w:ascii="Calibri" w:hAnsi="Calibri"/>
-          <w:color w:val="1E293B"/>
-          <w:sz w:val="21"/>
-        </w:rPr>
-        <w:t xml:space="preserve">, </w:t>
+        <w:t>ui_kit.py</w:t>
+      </w:r>
+      <w:r>
+        <w:rPr>
+          <w:rFonts w:ascii="Calibri" w:hAnsi="Calibri"/>
+          <w:color w:val="1E293B"/>
+          <w:sz w:val="21"/>
+        </w:rPr>
+        <w:t>), clean hero headers without badge clutter, interactive stepper (</w:t>
       </w:r>
       <w:r>
         <w:rPr>
@@ -5557,15 +5534,61 @@
           <w:color w:val="0F5182"/>
           <w:sz w:val="19"/>
         </w:rPr>
-        <w:t>gemini-3.8-flash</w:t>
-      </w:r>
-      <w:r>
-        <w:rPr>
-          <w:rFonts w:ascii="Calibri" w:hAnsi="Calibri"/>
-          <w:color w:val="1E293B"/>
-          <w:sz w:val="21"/>
-        </w:rPr>
-        <w:t>, etc.) with session blacklisting for 404s. Retired models (</w:t>
+        <w:t>UI.stepper</w:t>
+      </w:r>
+      <w:r>
+        <w:rPr>
+          <w:rFonts w:ascii="Calibri" w:hAnsi="Calibri"/>
+          <w:color w:val="1E293B"/>
+          <w:sz w:val="21"/>
+        </w:rPr>
+        <w:t>), and high-contrast neumorphic glass aesthetics.</w:t>
+      </w:r>
+    </w:p>
+    <w:p>
+      <w:pPr>
+        <w:pStyle w:val="ListBullet"/>
+        <w:spacing w:before="20" w:after="40"/>
+      </w:pPr>
+      <w:r>
+        <w:rPr>
+          <w:rFonts w:ascii="Calibri" w:hAnsi="Calibri"/>
+          <w:b/>
+          <w:color w:val="0F172A"/>
+          <w:sz w:val="21"/>
+        </w:rPr>
+        <w:t>Advisory Disclaimer &amp; Terms of Use:</w:t>
+      </w:r>
+      <w:r>
+        <w:rPr>
+          <w:rFonts w:ascii="Calibri" w:hAnsi="Calibri"/>
+          <w:color w:val="1E293B"/>
+          <w:sz w:val="21"/>
+        </w:rPr>
+        <w:t xml:space="preserve"> Globally rendered executive card footer on all application views specifying probabilistic AI nature, possible errors/false outputs, use at own risk, and terms of use agreement.</w:t>
+      </w:r>
+    </w:p>
+    <w:p>
+      <w:pPr>
+        <w:pStyle w:val="ListBullet"/>
+        <w:spacing w:before="20" w:after="40"/>
+      </w:pPr>
+      <w:r>
+        <w:rPr>
+          <w:rFonts w:ascii="Calibri" w:hAnsi="Calibri"/>
+          <w:b/>
+          <w:color w:val="0F172A"/>
+          <w:sz w:val="21"/>
+        </w:rPr>
+        <w:t>Dynamic Model Auto-Discovery &amp; Zero 404 Guarantee:</w:t>
+      </w:r>
+      <w:r>
+        <w:rPr>
+          <w:rFonts w:ascii="Calibri" w:hAnsi="Calibri"/>
+          <w:color w:val="1E293B"/>
+          <w:sz w:val="21"/>
+        </w:rPr>
+        <w:t xml:space="preserve"> Active tiered cascade (</w:t>
       </w:r>
       <w:r>
         <w:rPr>
@@ -5573,7 +5596,7 @@
           <w:color w:val="0F5182"/>
           <w:sz w:val="19"/>
         </w:rPr>
-        <w:t>gemini-pro</w:t>
+        <w:t>gemini-2.5-flash</w:t>
       </w:r>
       <w:r>
         <w:rPr>
@@ -5589,84 +5612,15 @@
           <w:color w:val="0F5182"/>
           <w:sz w:val="19"/>
         </w:rPr>
-        <w:t>gemini-1.5-flash</w:t>
-      </w:r>
-      <w:r>
-        <w:rPr>
-          <w:rFonts w:ascii="Calibri" w:hAnsi="Calibri"/>
-          <w:color w:val="1E293B"/>
-          <w:sz w:val="21"/>
-        </w:rPr>
-        <w:t>) can never cause cascading crashes.</w:t>
-      </w:r>
-    </w:p>
-    <w:p>
-      <w:pPr>
-        <w:pStyle w:val="ListBullet"/>
-        <w:spacing w:before="20" w:after="40"/>
-      </w:pPr>
-      <w:r>
-        <w:rPr>
-          <w:rFonts w:ascii="Calibri" w:hAnsi="Calibri"/>
-          <w:b/>
-          <w:color w:val="0F172A"/>
-          <w:sz w:val="21"/>
-        </w:rPr>
-        <w:t>Output Quality Verification Engine:</w:t>
-      </w:r>
-      <w:r>
-        <w:rPr>
-          <w:rFonts w:ascii="Calibri" w:hAnsi="Calibri"/>
-          <w:color w:val="1E293B"/>
-          <w:sz w:val="21"/>
-        </w:rPr>
-        <w:t xml:space="preserve"> In-process Multi-Agent Quality Controller evaluates sub-agent deliverables (completeness, specificity, requirements matrix depth, 5-dimensional questions, option validity, and 48-hour study roadmap viability) and binds real-time quality badges to the executive UI.</w:t>
-      </w:r>
-    </w:p>
-    <w:p>
-      <w:pPr>
-        <w:pStyle w:val="ListBullet"/>
-        <w:spacing w:before="20" w:after="40"/>
-      </w:pPr>
-      <w:r>
-        <w:rPr>
-          <w:rFonts w:ascii="Calibri" w:hAnsi="Calibri"/>
-          <w:b/>
-          <w:color w:val="0F172A"/>
-          <w:sz w:val="21"/>
-        </w:rPr>
-        <w:t>Non-Blocking Telemetry:</w:t>
-      </w:r>
-      <w:r>
-        <w:rPr>
-          <w:rFonts w:ascii="Calibri" w:hAnsi="Calibri"/>
-          <w:color w:val="1E293B"/>
-          <w:sz w:val="21"/>
-        </w:rPr>
-        <w:t xml:space="preserve"> Atomic timestamp reservation rate pacer guarantees &lt;=12 RPM while releasing mutex lock before sleep, keeping Streamlit UI telemetry 100% non-blocking.</w:t>
-      </w:r>
-    </w:p>
-    <w:p>
-      <w:pPr>
-        <w:pStyle w:val="ListBullet"/>
-        <w:spacing w:before="20" w:after="40"/>
-      </w:pPr>
-      <w:r>
-        <w:rPr>
-          <w:rFonts w:ascii="Calibri" w:hAnsi="Calibri"/>
-          <w:b/>
-          <w:color w:val="0F172A"/>
-          <w:sz w:val="21"/>
-        </w:rPr>
-        <w:t>Reporting:</w:t>
-      </w:r>
-      <w:r>
-        <w:rPr>
-          <w:rFonts w:ascii="Calibri" w:hAnsi="Calibri"/>
-          <w:color w:val="1E293B"/>
-          <w:sz w:val="21"/>
-        </w:rPr>
-        <w:t xml:space="preserve"> Standalone 2-3 page Strategic Fit Report PDF (</w:t>
+        <w:t>gemini-flash-latest</w:t>
+      </w:r>
+      <w:r>
+        <w:rPr>
+          <w:rFonts w:ascii="Calibri" w:hAnsi="Calibri"/>
+          <w:color w:val="1E293B"/>
+          <w:sz w:val="21"/>
+        </w:rPr>
+        <w:t xml:space="preserve">, </w:t>
       </w:r>
       <w:r>
         <w:rPr>
@@ -5674,70 +5628,15 @@
           <w:color w:val="0F5182"/>
           <w:sz w:val="19"/>
         </w:rPr>
-        <w:t>generate_fit_report_pdf</w:t>
-      </w:r>
-      <w:r>
-        <w:rPr>
-          <w:rFonts w:ascii="Calibri" w:hAnsi="Calibri"/>
-          <w:color w:val="1E293B"/>
-          <w:sz w:val="21"/>
-        </w:rPr>
-        <w:t>) and full multi-step Dossier PDF available on Step 2.</w:t>
-      </w:r>
-    </w:p>
-    <w:p>
-      <w:pPr>
-        <w:pStyle w:val="ListBullet"/>
-        <w:spacing w:before="20" w:after="40"/>
-      </w:pPr>
-      <w:r>
-        <w:rPr>
-          <w:rFonts w:ascii="Calibri" w:hAnsi="Calibri"/>
-          <w:b/>
-          <w:color w:val="0F172A"/>
-          <w:sz w:val="21"/>
-        </w:rPr>
-        <w:t>Dual-Mode Candidate Onboarding:</w:t>
-      </w:r>
-    </w:p>
-    <w:p>
-      <w:pPr>
-        <w:pStyle w:val="ListBullet"/>
-        <w:spacing w:before="20" w:after="40"/>
-      </w:pPr>
-      <w:r>
-        <w:rPr>
-          <w:rFonts w:ascii="Calibri" w:hAnsi="Calibri"/>
-          <w:b/>
-          <w:color w:val="0F172A"/>
-          <w:sz w:val="21"/>
-        </w:rPr>
-        <w:t>Option 1 (Fast Track):</w:t>
-      </w:r>
-      <w:r>
-        <w:rPr>
-          <w:rFonts w:ascii="Calibri" w:hAnsi="Calibri"/>
-          <w:color w:val="1E293B"/>
-          <w:sz w:val="21"/>
-        </w:rPr>
-        <w:t xml:space="preserve"> </w:t>
-      </w:r>
-      <w:r>
-        <w:rPr>
-          <w:rFonts w:ascii="Calibri" w:hAnsi="Calibri"/>
-          <w:i/>
-          <w:color w:val="334155"/>
-          <w:sz w:val="21"/>
-        </w:rPr>
-        <w:t>Run Strategic Fit &amp; Question Bank Alone</w:t>
-      </w:r>
-      <w:r>
-        <w:rPr>
-          <w:rFonts w:ascii="Calibri" w:hAnsi="Calibri"/>
-          <w:color w:val="1E293B"/>
-          <w:sz w:val="21"/>
-        </w:rPr>
-        <w:t xml:space="preserve"> (5 Stages, ~10–15s). Skips 30-MCQ online test calibration upfront, sanitizes state (</w:t>
+        <w:t>gemini-3.8-flash</w:t>
+      </w:r>
+      <w:r>
+        <w:rPr>
+          <w:rFonts w:ascii="Calibri" w:hAnsi="Calibri"/>
+          <w:color w:val="1E293B"/>
+          <w:sz w:val="21"/>
+        </w:rPr>
+        <w:t>, etc.) with session blacklisting for 404s. Retired models (</w:t>
       </w:r>
       <w:r>
         <w:rPr>
@@ -5745,6 +5644,178 @@
           <w:color w:val="0F5182"/>
           <w:sz w:val="19"/>
         </w:rPr>
+        <w:t>gemini-pro</w:t>
+      </w:r>
+      <w:r>
+        <w:rPr>
+          <w:rFonts w:ascii="Calibri" w:hAnsi="Calibri"/>
+          <w:color w:val="1E293B"/>
+          <w:sz w:val="21"/>
+        </w:rPr>
+        <w:t xml:space="preserve">, </w:t>
+      </w:r>
+      <w:r>
+        <w:rPr>
+          <w:rFonts w:ascii="Consolas" w:hAnsi="Consolas"/>
+          <w:color w:val="0F5182"/>
+          <w:sz w:val="19"/>
+        </w:rPr>
+        <w:t>gemini-1.5-flash</w:t>
+      </w:r>
+      <w:r>
+        <w:rPr>
+          <w:rFonts w:ascii="Calibri" w:hAnsi="Calibri"/>
+          <w:color w:val="1E293B"/>
+          <w:sz w:val="21"/>
+        </w:rPr>
+        <w:t>) can never cause cascading crashes.</w:t>
+      </w:r>
+    </w:p>
+    <w:p>
+      <w:pPr>
+        <w:pStyle w:val="ListBullet"/>
+        <w:spacing w:before="20" w:after="40"/>
+      </w:pPr>
+      <w:r>
+        <w:rPr>
+          <w:rFonts w:ascii="Calibri" w:hAnsi="Calibri"/>
+          <w:b/>
+          <w:color w:val="0F172A"/>
+          <w:sz w:val="21"/>
+        </w:rPr>
+        <w:t>Output Quality Verification Engine:</w:t>
+      </w:r>
+      <w:r>
+        <w:rPr>
+          <w:rFonts w:ascii="Calibri" w:hAnsi="Calibri"/>
+          <w:color w:val="1E293B"/>
+          <w:sz w:val="21"/>
+        </w:rPr>
+        <w:t xml:space="preserve"> In-process Multi-Agent Quality Controller evaluates sub-agent deliverables (completeness, specificity, requirements matrix depth, 5-dimensional questions, option validity, and 48-hour study roadmap viability) and binds real-time quality badges to the executive UI.</w:t>
+      </w:r>
+    </w:p>
+    <w:p>
+      <w:pPr>
+        <w:pStyle w:val="ListBullet"/>
+        <w:spacing w:before="20" w:after="40"/>
+      </w:pPr>
+      <w:r>
+        <w:rPr>
+          <w:rFonts w:ascii="Calibri" w:hAnsi="Calibri"/>
+          <w:b/>
+          <w:color w:val="0F172A"/>
+          <w:sz w:val="21"/>
+        </w:rPr>
+        <w:t>Non-Blocking Telemetry:</w:t>
+      </w:r>
+      <w:r>
+        <w:rPr>
+          <w:rFonts w:ascii="Calibri" w:hAnsi="Calibri"/>
+          <w:color w:val="1E293B"/>
+          <w:sz w:val="21"/>
+        </w:rPr>
+        <w:t xml:space="preserve"> Atomic timestamp reservation rate pacer guarantees &lt;=12 RPM while releasing mutex lock before sleep, keeping Streamlit UI telemetry 100% non-blocking.</w:t>
+      </w:r>
+    </w:p>
+    <w:p>
+      <w:pPr>
+        <w:pStyle w:val="ListBullet"/>
+        <w:spacing w:before="20" w:after="40"/>
+      </w:pPr>
+      <w:r>
+        <w:rPr>
+          <w:rFonts w:ascii="Calibri" w:hAnsi="Calibri"/>
+          <w:b/>
+          <w:color w:val="0F172A"/>
+          <w:sz w:val="21"/>
+        </w:rPr>
+        <w:t>Reporting:</w:t>
+      </w:r>
+      <w:r>
+        <w:rPr>
+          <w:rFonts w:ascii="Calibri" w:hAnsi="Calibri"/>
+          <w:color w:val="1E293B"/>
+          <w:sz w:val="21"/>
+        </w:rPr>
+        <w:t xml:space="preserve"> Standalone 2-3 page Strategic Fit Report PDF (</w:t>
+      </w:r>
+      <w:r>
+        <w:rPr>
+          <w:rFonts w:ascii="Consolas" w:hAnsi="Consolas"/>
+          <w:color w:val="0F5182"/>
+          <w:sz w:val="19"/>
+        </w:rPr>
+        <w:t>generate_fit_report_pdf</w:t>
+      </w:r>
+      <w:r>
+        <w:rPr>
+          <w:rFonts w:ascii="Calibri" w:hAnsi="Calibri"/>
+          <w:color w:val="1E293B"/>
+          <w:sz w:val="21"/>
+        </w:rPr>
+        <w:t>) and full multi-step Dossier PDF available on Step 2.</w:t>
+      </w:r>
+    </w:p>
+    <w:p>
+      <w:pPr>
+        <w:pStyle w:val="ListBullet"/>
+        <w:spacing w:before="20" w:after="40"/>
+      </w:pPr>
+      <w:r>
+        <w:rPr>
+          <w:rFonts w:ascii="Calibri" w:hAnsi="Calibri"/>
+          <w:b/>
+          <w:color w:val="0F172A"/>
+          <w:sz w:val="21"/>
+        </w:rPr>
+        <w:t>Dual-Mode Candidate Onboarding:</w:t>
+      </w:r>
+    </w:p>
+    <w:p>
+      <w:pPr>
+        <w:pStyle w:val="ListBullet"/>
+        <w:spacing w:before="20" w:after="40"/>
+      </w:pPr>
+      <w:r>
+        <w:rPr>
+          <w:rFonts w:ascii="Calibri" w:hAnsi="Calibri"/>
+          <w:b/>
+          <w:color w:val="0F172A"/>
+          <w:sz w:val="21"/>
+        </w:rPr>
+        <w:t>Option 1 (Fast Track):</w:t>
+      </w:r>
+      <w:r>
+        <w:rPr>
+          <w:rFonts w:ascii="Calibri" w:hAnsi="Calibri"/>
+          <w:color w:val="1E293B"/>
+          <w:sz w:val="21"/>
+        </w:rPr>
+        <w:t xml:space="preserve"> </w:t>
+      </w:r>
+      <w:r>
+        <w:rPr>
+          <w:rFonts w:ascii="Calibri" w:hAnsi="Calibri"/>
+          <w:i/>
+          <w:color w:val="334155"/>
+          <w:sz w:val="21"/>
+        </w:rPr>
+        <w:t>Run Strategic Fit &amp; Question Bank Alone</w:t>
+      </w:r>
+      <w:r>
+        <w:rPr>
+          <w:rFonts w:ascii="Calibri" w:hAnsi="Calibri"/>
+          <w:color w:val="1E293B"/>
+          <w:sz w:val="21"/>
+        </w:rPr>
+        <w:t xml:space="preserve"> (5 Stages, ~10–15s). Skips 30-MCQ online test calibration upfront, sanitizes state (</w:t>
+      </w:r>
+      <w:r>
+        <w:rPr>
+          <w:rFonts w:ascii="Consolas" w:hAnsi="Consolas"/>
+          <w:color w:val="0F5182"/>
+          <w:sz w:val="19"/>
+        </w:rPr>
         <w:t>online_test = None</w:t>
       </w:r>
       <w:r>
@@ -6520,6 +6591,21 @@
     </w:p>
     <w:p>
       <w:pPr>
+        <w:pStyle w:val="ListBullet"/>
+        <w:spacing w:before="20" w:after="40"/>
+      </w:pPr>
+      <w:r>
+        <w:rPr>
+          <w:rFonts w:ascii="Calibri" w:hAnsi="Calibri"/>
+          <w:b/>
+          <w:color w:val="0F172A"/>
+          <w:sz w:val="21"/>
+        </w:rPr>
+        <w:t>Session #27 Accomplishments:</w:t>
+      </w:r>
+    </w:p>
+    <w:p>
+      <w:pPr>
         <w:pStyle w:val="ListNumber"/>
         <w:spacing w:before="20" w:after="40"/>
       </w:pPr>
@@ -6529,7 +6615,7 @@
           <w:color w:val="1E293B"/>
           <w:sz w:val="21"/>
         </w:rPr>
-        <w:t>Rebuilt all 5 executive Microsoft Word (</w:t>
+        <w:t xml:space="preserve">Created root entrypoint </w:t>
       </w:r>
       <w:r>
         <w:rPr>
@@ -6537,15 +6623,15 @@
           <w:color w:val="0F5182"/>
           <w:sz w:val="19"/>
         </w:rPr>
-        <w:t>.docx</w:t>
-      </w:r>
-      <w:r>
-        <w:rPr>
-          <w:rFonts w:ascii="Calibri" w:hAnsi="Calibri"/>
-          <w:color w:val="1E293B"/>
-          <w:sz w:val="21"/>
-        </w:rPr>
-        <w:t xml:space="preserve">) dossiers in </w:t>
+        <w:t>streamlit_app.py</w:t>
+      </w:r>
+      <w:r>
+        <w:rPr>
+          <w:rFonts w:ascii="Calibri" w:hAnsi="Calibri"/>
+          <w:color w:val="1E293B"/>
+          <w:sz w:val="21"/>
+        </w:rPr>
+        <w:t xml:space="preserve"> bridging directly to </w:t>
       </w:r>
       <w:r>
         <w:rPr>
@@ -6553,6 +6639,144 @@
           <w:color w:val="0F5182"/>
           <w:sz w:val="19"/>
         </w:rPr>
+        <w:t>frontend/app.py</w:t>
+      </w:r>
+      <w:r>
+        <w:rPr>
+          <w:rFonts w:ascii="Calibri" w:hAnsi="Calibri"/>
+          <w:color w:val="1E293B"/>
+          <w:sz w:val="21"/>
+        </w:rPr>
+        <w:t>, satisfying Streamlit Community Cloud's default repository search path.</w:t>
+      </w:r>
+    </w:p>
+    <w:p>
+      <w:pPr>
+        <w:pStyle w:val="ListNumber"/>
+        <w:spacing w:before="20" w:after="40"/>
+      </w:pPr>
+      <w:r>
+        <w:rPr>
+          <w:rFonts w:ascii="Calibri" w:hAnsi="Calibri"/>
+          <w:color w:val="1E293B"/>
+          <w:sz w:val="21"/>
+        </w:rPr>
+        <w:t xml:space="preserve">Guided resolution of DNS subdomain validation error: replacing </w:t>
+      </w:r>
+      <w:r>
+        <w:rPr>
+          <w:rFonts w:ascii="Consolas" w:hAnsi="Consolas"/>
+          <w:color w:val="0F5182"/>
+          <w:sz w:val="19"/>
+        </w:rPr>
+        <w:t>interview_iq</w:t>
+      </w:r>
+      <w:r>
+        <w:rPr>
+          <w:rFonts w:ascii="Calibri" w:hAnsi="Calibri"/>
+          <w:color w:val="1E293B"/>
+          <w:sz w:val="21"/>
+        </w:rPr>
+        <w:t xml:space="preserve"> (invalid underscore) with </w:t>
+      </w:r>
+      <w:r>
+        <w:rPr>
+          <w:rFonts w:ascii="Consolas" w:hAnsi="Consolas"/>
+          <w:color w:val="0F5182"/>
+          <w:sz w:val="19"/>
+        </w:rPr>
+        <w:t>interview-iq</w:t>
+      </w:r>
+      <w:r>
+        <w:rPr>
+          <w:rFonts w:ascii="Calibri" w:hAnsi="Calibri"/>
+          <w:color w:val="1E293B"/>
+          <w:sz w:val="21"/>
+        </w:rPr>
+        <w:t xml:space="preserve"> (RFC compliant hyphen).</w:t>
+      </w:r>
+    </w:p>
+    <w:p>
+      <w:pPr>
+        <w:pStyle w:val="ListNumber"/>
+        <w:spacing w:before="20" w:after="40"/>
+      </w:pPr>
+      <w:r>
+        <w:rPr>
+          <w:rFonts w:ascii="Calibri" w:hAnsi="Calibri"/>
+          <w:color w:val="1E293B"/>
+          <w:sz w:val="21"/>
+        </w:rPr>
+        <w:t xml:space="preserve">Fortified </w:t>
+      </w:r>
+      <w:r>
+        <w:rPr>
+          <w:rFonts w:ascii="Consolas" w:hAnsi="Consolas"/>
+          <w:color w:val="0F5182"/>
+          <w:sz w:val="19"/>
+        </w:rPr>
+        <w:t>tests/test_uat_streamlit_app.py</w:t>
+      </w:r>
+      <w:r>
+        <w:rPr>
+          <w:rFonts w:ascii="Calibri" w:hAnsi="Calibri"/>
+          <w:color w:val="1E293B"/>
+          <w:sz w:val="21"/>
+        </w:rPr>
+        <w:t xml:space="preserve"> to be environment-agnostic, handling both pre-authenticated and clean sessions.</w:t>
+      </w:r>
+    </w:p>
+    <w:p>
+      <w:pPr>
+        <w:pStyle w:val="ListNumber"/>
+        <w:spacing w:before="20" w:after="40"/>
+      </w:pPr>
+      <w:r>
+        <w:rPr>
+          <w:rFonts w:ascii="Calibri" w:hAnsi="Calibri"/>
+          <w:color w:val="1E293B"/>
+          <w:sz w:val="21"/>
+        </w:rPr>
+        <w:t xml:space="preserve">Authored </w:t>
+      </w:r>
+      <w:r>
+        <w:rPr>
+          <w:rFonts w:ascii="Consolas" w:hAnsi="Consolas"/>
+          <w:color w:val="0F5182"/>
+          <w:sz w:val="19"/>
+        </w:rPr>
+        <w:t>docs/GITHUB_DEPLOYMENT_AND_PUSH_STRATEGY.md</w:t>
+      </w:r>
+      <w:r>
+        <w:rPr>
+          <w:rFonts w:ascii="Calibri" w:hAnsi="Calibri"/>
+          <w:color w:val="1E293B"/>
+          <w:sz w:val="21"/>
+        </w:rPr>
+        <w:t xml:space="preserve"> and regenerated all 6 Microsoft Word (</w:t>
+      </w:r>
+      <w:r>
+        <w:rPr>
+          <w:rFonts w:ascii="Consolas" w:hAnsi="Consolas"/>
+          <w:color w:val="0F5182"/>
+          <w:sz w:val="19"/>
+        </w:rPr>
+        <w:t>.docx</w:t>
+      </w:r>
+      <w:r>
+        <w:rPr>
+          <w:rFonts w:ascii="Calibri" w:hAnsi="Calibri"/>
+          <w:color w:val="1E293B"/>
+          <w:sz w:val="21"/>
+        </w:rPr>
+        <w:t xml:space="preserve">) dossiers in </w:t>
+      </w:r>
+      <w:r>
+        <w:rPr>
+          <w:rFonts w:ascii="Consolas" w:hAnsi="Consolas"/>
+          <w:color w:val="0F5182"/>
+          <w:sz w:val="19"/>
+        </w:rPr>
         <w:t>/docs</w:t>
       </w:r>
       <w:r>
@@ -6598,7 +6822,7 @@
           <w:color w:val="1E293B"/>
           <w:sz w:val="21"/>
         </w:rPr>
-        <w:t xml:space="preserve"> GitHub Actions CI failure eradicated, container security hardened, and deployment scripts modernized.</w:t>
+        <w:t xml:space="preserve"> GitHub Actions CI failure eradicated, container security hardened, Streamlit Community Cloud root entrypoint deployed, and deployment documentation published.</w:t>
       </w:r>
     </w:p>
     <w:p>
@@ -6621,7 +6845,7 @@
           <w:color w:val="1E293B"/>
           <w:sz w:val="21"/>
         </w:rPr>
-        <w:t xml:space="preserve"> 100% test pass rate across all 101 tests in 26.65s with zero regressions.</w:t>
+        <w:t xml:space="preserve"> 100% test pass rate across all 101 tests in 22.5s with zero regressions.</w:t>
       </w:r>
     </w:p>
     <w:p>
@@ -6893,7 +7117,128 @@
           <w:color w:val="0F172A"/>
           <w:sz w:val="21"/>
         </w:rPr>
-        <w:t>Launch Environment:</w:t>
+        <w:t>Streamlit Community Cloud Deployment Verification:</w:t>
+      </w:r>
+    </w:p>
+    <w:p>
+      <w:pPr>
+        <w:pStyle w:val="ListBullet"/>
+        <w:spacing w:before="20" w:after="40"/>
+      </w:pPr>
+      <w:r>
+        <w:rPr>
+          <w:rFonts w:ascii="Calibri" w:hAnsi="Calibri"/>
+          <w:color w:val="1E293B"/>
+          <w:sz w:val="21"/>
+        </w:rPr>
+        <w:t>Navigate to [share.streamlit.io](https://share.streamlit.io).</w:t>
+      </w:r>
+    </w:p>
+    <w:p>
+      <w:pPr>
+        <w:pStyle w:val="ListBullet"/>
+        <w:spacing w:before="20" w:after="40"/>
+      </w:pPr>
+      <w:r>
+        <w:rPr>
+          <w:rFonts w:ascii="Calibri" w:hAnsi="Calibri"/>
+          <w:color w:val="1E293B"/>
+          <w:sz w:val="21"/>
+        </w:rPr>
+        <w:t xml:space="preserve">Confirm application status for </w:t>
+      </w:r>
+      <w:r>
+        <w:rPr>
+          <w:rFonts w:ascii="Consolas" w:hAnsi="Consolas"/>
+          <w:color w:val="0F5182"/>
+          <w:sz w:val="19"/>
+        </w:rPr>
+        <w:t>Hello-Nitish/Interview_IQ</w:t>
+      </w:r>
+      <w:r>
+        <w:rPr>
+          <w:rFonts w:ascii="Calibri" w:hAnsi="Calibri"/>
+          <w:color w:val="1E293B"/>
+          <w:sz w:val="21"/>
+        </w:rPr>
+        <w:t xml:space="preserve"> with </w:t>
+      </w:r>
+      <w:r>
+        <w:rPr>
+          <w:rFonts w:ascii="Consolas" w:hAnsi="Consolas"/>
+          <w:color w:val="0F5182"/>
+          <w:sz w:val="19"/>
+        </w:rPr>
+        <w:t>main</w:t>
+      </w:r>
+      <w:r>
+        <w:rPr>
+          <w:rFonts w:ascii="Calibri" w:hAnsi="Calibri"/>
+          <w:color w:val="1E293B"/>
+          <w:sz w:val="21"/>
+        </w:rPr>
+        <w:t xml:space="preserve"> branch and </w:t>
+      </w:r>
+      <w:r>
+        <w:rPr>
+          <w:rFonts w:ascii="Consolas" w:hAnsi="Consolas"/>
+          <w:color w:val="0F5182"/>
+          <w:sz w:val="19"/>
+        </w:rPr>
+        <w:t>streamlit_app.py</w:t>
+      </w:r>
+      <w:r>
+        <w:rPr>
+          <w:rFonts w:ascii="Calibri" w:hAnsi="Calibri"/>
+          <w:color w:val="1E293B"/>
+          <w:sz w:val="21"/>
+        </w:rPr>
+        <w:t>.</w:t>
+      </w:r>
+    </w:p>
+    <w:p>
+      <w:pPr>
+        <w:pStyle w:val="ListBullet"/>
+        <w:spacing w:before="20" w:after="40"/>
+      </w:pPr>
+      <w:r>
+        <w:rPr>
+          <w:rFonts w:ascii="Calibri" w:hAnsi="Calibri"/>
+          <w:color w:val="1E293B"/>
+          <w:sz w:val="21"/>
+        </w:rPr>
+        <w:t xml:space="preserve">Access the live application URL (e.g. </w:t>
+      </w:r>
+      <w:r>
+        <w:rPr>
+          <w:rFonts w:ascii="Consolas" w:hAnsi="Consolas"/>
+          <w:color w:val="0F5182"/>
+          <w:sz w:val="19"/>
+        </w:rPr>
+        <w:t>https://interview-iq.streamlit.app</w:t>
+      </w:r>
+      <w:r>
+        <w:rPr>
+          <w:rFonts w:ascii="Calibri" w:hAnsi="Calibri"/>
+          <w:color w:val="1E293B"/>
+          <w:sz w:val="21"/>
+        </w:rPr>
+        <w:t>).</w:t>
+      </w:r>
+    </w:p>
+    <w:p>
+      <w:pPr>
+        <w:pStyle w:val="ListNumber"/>
+        <w:spacing w:before="20" w:after="40"/>
+      </w:pPr>
+      <w:r>
+        <w:rPr>
+          <w:rFonts w:ascii="Calibri" w:hAnsi="Calibri"/>
+          <w:b/>
+          <w:color w:val="0F172A"/>
+          <w:sz w:val="21"/>
+        </w:rPr>
+        <w:t>Local Development Launch:</w:t>
       </w:r>
     </w:p>
     <w:p>
@@ -7074,7 +7419,7 @@
                 <w:color w:val="0F172A"/>
                 <w:sz w:val="18"/>
               </w:rPr>
-              <w:t xml:space="preserve">     .\.venv\Scripts\python.exe -m unittest discover tests</w:t>
+              <w:t xml:space="preserve">     .\.venv\Scripts\python.exe -m unittest discover -s tests -p "test_*.py"</w:t>
             </w:r>
           </w:p>
         </w:tc>
@@ -7096,7 +7441,7 @@
           <w:color w:val="1E293B"/>
           <w:sz w:val="21"/>
         </w:rPr>
-        <w:t>Confirm all 93 tests pass (100% pass rate).</w:t>
+        <w:t>Confirm all 101 tests pass (100% pass rate).</w:t>
       </w:r>
     </w:p>
     <w:p>

</xml_diff>

<commit_message>
feat: add mobile and tablet viewport switcher, 4-tier responsive grid, touch ergonomics, and dedicated word guide
</commit_message>
<xml_diff>
--- a/docs/KT_DOCUMENT.docx
+++ b/docs/KT_DOCUMENT.docx
@@ -6790,6 +6790,441 @@
     </w:p>
     <w:p>
       <w:pPr>
+        <w:pStyle w:val="ListBullet"/>
+        <w:spacing w:before="20" w:after="40"/>
+      </w:pPr>
+      <w:r>
+        <w:rPr>
+          <w:rFonts w:ascii="Calibri" w:hAnsi="Calibri"/>
+          <w:b/>
+          <w:color w:val="0F172A"/>
+          <w:sz w:val="21"/>
+        </w:rPr>
+        <w:t>Session #28 Accomplishments:</w:t>
+      </w:r>
+    </w:p>
+    <w:p>
+      <w:pPr>
+        <w:pStyle w:val="ListNumber"/>
+        <w:spacing w:before="20" w:after="40"/>
+      </w:pPr>
+      <w:r>
+        <w:rPr>
+          <w:rFonts w:ascii="Calibri" w:hAnsi="Calibri"/>
+          <w:color w:val="1E293B"/>
+          <w:sz w:val="21"/>
+        </w:rPr>
+        <w:t xml:space="preserve">Engineered an interactive Viewport Mode switcher in </w:t>
+      </w:r>
+      <w:r>
+        <w:rPr>
+          <w:rFonts w:ascii="Consolas" w:hAnsi="Consolas"/>
+          <w:color w:val="0F5182"/>
+          <w:sz w:val="19"/>
+        </w:rPr>
+        <w:t>frontend/app.py</w:t>
+      </w:r>
+      <w:r>
+        <w:rPr>
+          <w:rFonts w:ascii="Calibri" w:hAnsi="Calibri"/>
+          <w:color w:val="1E293B"/>
+          <w:sz w:val="21"/>
+        </w:rPr>
+        <w:t xml:space="preserve"> and </w:t>
+      </w:r>
+      <w:r>
+        <w:rPr>
+          <w:rFonts w:ascii="Consolas" w:hAnsi="Consolas"/>
+          <w:color w:val="0F5182"/>
+          <w:sz w:val="19"/>
+        </w:rPr>
+        <w:t>frontend/styles/theme.py</w:t>
+      </w:r>
+      <w:r>
+        <w:rPr>
+          <w:rFonts w:ascii="Calibri" w:hAnsi="Calibri"/>
+          <w:color w:val="1E293B"/>
+          <w:sz w:val="21"/>
+        </w:rPr>
+        <w:t xml:space="preserve"> with 4 operational modes (</w:t>
+      </w:r>
+      <w:r>
+        <w:rPr>
+          <w:rFonts w:ascii="Consolas" w:hAnsi="Consolas"/>
+          <w:color w:val="0F5182"/>
+          <w:sz w:val="19"/>
+        </w:rPr>
+        <w:t>🖥️ Auto (Responsive)</w:t>
+      </w:r>
+      <w:r>
+        <w:rPr>
+          <w:rFonts w:ascii="Calibri" w:hAnsi="Calibri"/>
+          <w:color w:val="1E293B"/>
+          <w:sz w:val="21"/>
+        </w:rPr>
+        <w:t xml:space="preserve">, </w:t>
+      </w:r>
+      <w:r>
+        <w:rPr>
+          <w:rFonts w:ascii="Consolas" w:hAnsi="Consolas"/>
+          <w:color w:val="0F5182"/>
+          <w:sz w:val="19"/>
+        </w:rPr>
+        <w:t>📱 Mobile View (390px)</w:t>
+      </w:r>
+      <w:r>
+        <w:rPr>
+          <w:rFonts w:ascii="Calibri" w:hAnsi="Calibri"/>
+          <w:color w:val="1E293B"/>
+          <w:sz w:val="21"/>
+        </w:rPr>
+        <w:t xml:space="preserve">, </w:t>
+      </w:r>
+      <w:r>
+        <w:rPr>
+          <w:rFonts w:ascii="Consolas" w:hAnsi="Consolas"/>
+          <w:color w:val="0F5182"/>
+          <w:sz w:val="19"/>
+        </w:rPr>
+        <w:t>📟 Tablet View (820px)</w:t>
+      </w:r>
+      <w:r>
+        <w:rPr>
+          <w:rFonts w:ascii="Calibri" w:hAnsi="Calibri"/>
+          <w:color w:val="1E293B"/>
+          <w:sz w:val="21"/>
+        </w:rPr>
+        <w:t xml:space="preserve">, </w:t>
+      </w:r>
+      <w:r>
+        <w:rPr>
+          <w:rFonts w:ascii="Consolas" w:hAnsi="Consolas"/>
+          <w:color w:val="0F5182"/>
+          <w:sz w:val="19"/>
+        </w:rPr>
+        <w:t>💻 Desktop (Wide)</w:t>
+      </w:r>
+      <w:r>
+        <w:rPr>
+          <w:rFonts w:ascii="Calibri" w:hAnsi="Calibri"/>
+          <w:color w:val="1E293B"/>
+          <w:sz w:val="21"/>
+        </w:rPr>
+        <w:t>) enabling desktop simulation of smartphone and tablet devices with drop shadows and single-column forced stacking.</w:t>
+      </w:r>
+    </w:p>
+    <w:p>
+      <w:pPr>
+        <w:pStyle w:val="ListNumber"/>
+        <w:spacing w:before="20" w:after="40"/>
+      </w:pPr>
+      <w:r>
+        <w:rPr>
+          <w:rFonts w:ascii="Calibri" w:hAnsi="Calibri"/>
+          <w:color w:val="1E293B"/>
+          <w:sz w:val="21"/>
+        </w:rPr>
+        <w:t xml:space="preserve">Implemented a 4-tier responsive CSS grid engine in </w:t>
+      </w:r>
+      <w:r>
+        <w:rPr>
+          <w:rFonts w:ascii="Consolas" w:hAnsi="Consolas"/>
+          <w:color w:val="0F5182"/>
+          <w:sz w:val="19"/>
+        </w:rPr>
+        <w:t>frontend/styles/neumorphism.css</w:t>
+      </w:r>
+      <w:r>
+        <w:rPr>
+          <w:rFonts w:ascii="Calibri" w:hAnsi="Calibri"/>
+          <w:color w:val="1E293B"/>
+          <w:sz w:val="21"/>
+        </w:rPr>
+        <w:t xml:space="preserve"> (&lt;480px compact mobile, 480px–768px standard mobile, 769px–1024px tablet, &gt;1024px desktop) with </w:t>
+      </w:r>
+      <w:r>
+        <w:rPr>
+          <w:rFonts w:ascii="Consolas" w:hAnsi="Consolas"/>
+          <w:color w:val="0F5182"/>
+          <w:sz w:val="19"/>
+        </w:rPr>
+        <w:t>.responsive-stat-grid</w:t>
+      </w:r>
+      <w:r>
+        <w:rPr>
+          <w:rFonts w:ascii="Calibri" w:hAnsi="Calibri"/>
+          <w:color w:val="1E293B"/>
+          <w:sz w:val="21"/>
+        </w:rPr>
+        <w:t xml:space="preserve">, </w:t>
+      </w:r>
+      <w:r>
+        <w:rPr>
+          <w:rFonts w:ascii="Consolas" w:hAnsi="Consolas"/>
+          <w:color w:val="0F5182"/>
+          <w:sz w:val="19"/>
+        </w:rPr>
+        <w:t>.culture-grid</w:t>
+      </w:r>
+      <w:r>
+        <w:rPr>
+          <w:rFonts w:ascii="Calibri" w:hAnsi="Calibri"/>
+          <w:color w:val="1E293B"/>
+          <w:sz w:val="21"/>
+        </w:rPr>
+        <w:t>, and horizontal touch-scrollable tabs (</w:t>
+      </w:r>
+      <w:r>
+        <w:rPr>
+          <w:rFonts w:ascii="Consolas" w:hAnsi="Consolas"/>
+          <w:color w:val="0F5182"/>
+          <w:sz w:val="19"/>
+        </w:rPr>
+        <w:t>[data-baseweb="tab-list"]</w:t>
+      </w:r>
+      <w:r>
+        <w:rPr>
+          <w:rFonts w:ascii="Calibri" w:hAnsi="Calibri"/>
+          <w:color w:val="1E293B"/>
+          <w:sz w:val="21"/>
+        </w:rPr>
+        <w:t>).</w:t>
+      </w:r>
+    </w:p>
+    <w:p>
+      <w:pPr>
+        <w:pStyle w:val="ListNumber"/>
+        <w:spacing w:before="20" w:after="40"/>
+      </w:pPr>
+      <w:r>
+        <w:rPr>
+          <w:rFonts w:ascii="Calibri" w:hAnsi="Calibri"/>
+          <w:color w:val="1E293B"/>
+          <w:sz w:val="21"/>
+        </w:rPr>
+        <w:t>Enforced WCAG 2.5.5 touch target compliance ($\ge 44$px) across buttons, MCQ options, and widened Step 6 curriculum checkboxes to 15% width.</w:t>
+      </w:r>
+    </w:p>
+    <w:p>
+      <w:pPr>
+        <w:pStyle w:val="ListNumber"/>
+        <w:spacing w:before="20" w:after="40"/>
+      </w:pPr>
+      <w:r>
+        <w:rPr>
+          <w:rFonts w:ascii="Calibri" w:hAnsi="Calibri"/>
+          <w:color w:val="1E293B"/>
+          <w:sz w:val="21"/>
+        </w:rPr>
+        <w:t xml:space="preserve">Added adaptive label folding in </w:t>
+      </w:r>
+      <w:r>
+        <w:rPr>
+          <w:rFonts w:ascii="Consolas" w:hAnsi="Consolas"/>
+          <w:color w:val="0F5182"/>
+          <w:sz w:val="19"/>
+        </w:rPr>
+        <w:t>UI.stepper</w:t>
+      </w:r>
+      <w:r>
+        <w:rPr>
+          <w:rFonts w:ascii="Calibri" w:hAnsi="Calibri"/>
+          <w:color w:val="1E293B"/>
+          <w:sz w:val="21"/>
+        </w:rPr>
+        <w:t xml:space="preserve"> (&lt;576px) and fluid typography scaling via CSS </w:t>
+      </w:r>
+      <w:r>
+        <w:rPr>
+          <w:rFonts w:ascii="Consolas" w:hAnsi="Consolas"/>
+          <w:color w:val="0F5182"/>
+          <w:sz w:val="19"/>
+        </w:rPr>
+        <w:t>clamp()</w:t>
+      </w:r>
+      <w:r>
+        <w:rPr>
+          <w:rFonts w:ascii="Calibri" w:hAnsi="Calibri"/>
+          <w:color w:val="1E293B"/>
+          <w:sz w:val="21"/>
+        </w:rPr>
+        <w:t xml:space="preserve"> in </w:t>
+      </w:r>
+      <w:r>
+        <w:rPr>
+          <w:rFonts w:ascii="Consolas" w:hAnsi="Consolas"/>
+          <w:color w:val="0F5182"/>
+          <w:sz w:val="19"/>
+        </w:rPr>
+        <w:t>UI.metric_card</w:t>
+      </w:r>
+      <w:r>
+        <w:rPr>
+          <w:rFonts w:ascii="Calibri" w:hAnsi="Calibri"/>
+          <w:color w:val="1E293B"/>
+          <w:sz w:val="21"/>
+        </w:rPr>
+        <w:t xml:space="preserve">, </w:t>
+      </w:r>
+      <w:r>
+        <w:rPr>
+          <w:rFonts w:ascii="Consolas" w:hAnsi="Consolas"/>
+          <w:color w:val="0F5182"/>
+          <w:sz w:val="19"/>
+        </w:rPr>
+        <w:t>UI.stat_card</w:t>
+      </w:r>
+      <w:r>
+        <w:rPr>
+          <w:rFonts w:ascii="Calibri" w:hAnsi="Calibri"/>
+          <w:color w:val="1E293B"/>
+          <w:sz w:val="21"/>
+        </w:rPr>
+        <w:t xml:space="preserve">, and </w:t>
+      </w:r>
+      <w:r>
+        <w:rPr>
+          <w:rFonts w:ascii="Consolas" w:hAnsi="Consolas"/>
+          <w:color w:val="0F5182"/>
+          <w:sz w:val="19"/>
+        </w:rPr>
+        <w:t>UI.hero_header</w:t>
+      </w:r>
+      <w:r>
+        <w:rPr>
+          <w:rFonts w:ascii="Calibri" w:hAnsi="Calibri"/>
+          <w:color w:val="1E293B"/>
+          <w:sz w:val="21"/>
+        </w:rPr>
+        <w:t>.</w:t>
+      </w:r>
+    </w:p>
+    <w:p>
+      <w:pPr>
+        <w:pStyle w:val="ListNumber"/>
+        <w:spacing w:before="20" w:after="40"/>
+      </w:pPr>
+      <w:r>
+        <w:rPr>
+          <w:rFonts w:ascii="Calibri" w:hAnsi="Calibri"/>
+          <w:color w:val="1E293B"/>
+          <w:sz w:val="21"/>
+        </w:rPr>
+        <w:t xml:space="preserve">Conditioned </w:t>
+      </w:r>
+      <w:r>
+        <w:rPr>
+          <w:rFonts w:ascii="Consolas" w:hAnsi="Consolas"/>
+          <w:color w:val="0F5182"/>
+          <w:sz w:val="19"/>
+        </w:rPr>
+        <w:t>voice_recorder.html</w:t>
+      </w:r>
+      <w:r>
+        <w:rPr>
+          <w:rFonts w:ascii="Calibri" w:hAnsi="Calibri"/>
+          <w:color w:val="1E293B"/>
+          <w:sz w:val="21"/>
+        </w:rPr>
+        <w:t xml:space="preserve"> with viewport meta tag, 16px iOS auto-zoom elimination, and 280px container height.</w:t>
+      </w:r>
+    </w:p>
+    <w:p>
+      <w:pPr>
+        <w:pStyle w:val="ListNumber"/>
+        <w:spacing w:before="20" w:after="40"/>
+      </w:pPr>
+      <w:r>
+        <w:rPr>
+          <w:rFonts w:ascii="Calibri" w:hAnsi="Calibri"/>
+          <w:color w:val="1E293B"/>
+          <w:sz w:val="21"/>
+        </w:rPr>
+        <w:t xml:space="preserve">Expanded automated test suite from 101 to </w:t>
+      </w:r>
+      <w:r>
+        <w:rPr>
+          <w:rFonts w:ascii="Calibri" w:hAnsi="Calibri"/>
+          <w:b/>
+          <w:color w:val="0F172A"/>
+          <w:sz w:val="21"/>
+        </w:rPr>
+        <w:t>108 tests</w:t>
+      </w:r>
+      <w:r>
+        <w:rPr>
+          <w:rFonts w:ascii="Calibri" w:hAnsi="Calibri"/>
+          <w:color w:val="1E293B"/>
+          <w:sz w:val="21"/>
+        </w:rPr>
+        <w:t xml:space="preserve"> (19 UI kit tests, 13 Streamlit UAT tests) with a </w:t>
+      </w:r>
+      <w:r>
+        <w:rPr>
+          <w:rFonts w:ascii="Calibri" w:hAnsi="Calibri"/>
+          <w:b/>
+          <w:color w:val="0F172A"/>
+          <w:sz w:val="21"/>
+        </w:rPr>
+        <w:t>100% pass rate in 32.4s</w:t>
+      </w:r>
+      <w:r>
+        <w:rPr>
+          <w:rFonts w:ascii="Calibri" w:hAnsi="Calibri"/>
+          <w:color w:val="1E293B"/>
+          <w:sz w:val="21"/>
+        </w:rPr>
+        <w:t>.</w:t>
+      </w:r>
+    </w:p>
+    <w:p>
+      <w:pPr>
+        <w:pStyle w:val="ListNumber"/>
+        <w:spacing w:before="20" w:after="40"/>
+      </w:pPr>
+      <w:r>
+        <w:rPr>
+          <w:rFonts w:ascii="Calibri" w:hAnsi="Calibri"/>
+          <w:color w:val="1E293B"/>
+          <w:sz w:val="21"/>
+        </w:rPr>
+        <w:t xml:space="preserve">Authored </w:t>
+      </w:r>
+      <w:r>
+        <w:rPr>
+          <w:rFonts w:ascii="Consolas" w:hAnsi="Consolas"/>
+          <w:color w:val="0F5182"/>
+          <w:sz w:val="19"/>
+        </w:rPr>
+        <w:t>docs/MOBILE_AND_TAB_VIEW_GUIDE.md</w:t>
+      </w:r>
+      <w:r>
+        <w:rPr>
+          <w:rFonts w:ascii="Calibri" w:hAnsi="Calibri"/>
+          <w:color w:val="1E293B"/>
+          <w:sz w:val="21"/>
+        </w:rPr>
+        <w:t xml:space="preserve"> and compiled </w:t>
+      </w:r>
+      <w:r>
+        <w:rPr>
+          <w:rFonts w:ascii="Consolas" w:hAnsi="Consolas"/>
+          <w:color w:val="0F5182"/>
+          <w:sz w:val="19"/>
+        </w:rPr>
+        <w:t>docs/MOBILE_AND_TAB_VIEW_GUIDE.docx</w:t>
+      </w:r>
+      <w:r>
+        <w:rPr>
+          <w:rFonts w:ascii="Calibri" w:hAnsi="Calibri"/>
+          <w:color w:val="1E293B"/>
+          <w:sz w:val="21"/>
+        </w:rPr>
+        <w:t>.</w:t>
+      </w:r>
+    </w:p>
+    <w:p>
+      <w:pPr>
         <w:spacing w:before="200" w:after="60"/>
       </w:pPr>
       <w:r>
@@ -6822,7 +7257,7 @@
           <w:color w:val="1E293B"/>
           <w:sz w:val="21"/>
         </w:rPr>
-        <w:t xml:space="preserve"> GitHub Actions CI failure eradicated, container security hardened, Streamlit Community Cloud root entrypoint deployed, and deployment documentation published.</w:t>
+        <w:t xml:space="preserve"> Mobile and Tablet viewport modes, responsive CSS grid engine, touch ergonomics, and comprehensive documentation have been completely implemented and verified.</w:t>
       </w:r>
     </w:p>
     <w:p>
@@ -6845,7 +7280,7 @@
           <w:color w:val="1E293B"/>
           <w:sz w:val="21"/>
         </w:rPr>
-        <w:t xml:space="preserve"> 100% test pass rate across all 101 tests in 22.5s with zero regressions.</w:t>
+        <w:t xml:space="preserve"> 100% test pass rate across all 108 tests in 32.4s with zero regressions.</w:t>
       </w:r>
     </w:p>
     <w:p>
@@ -7309,6 +7744,101 @@
           <w:color w:val="0F172A"/>
           <w:sz w:val="21"/>
         </w:rPr>
+        <w:t>Test Viewport Modes in Sidebar:</w:t>
+      </w:r>
+    </w:p>
+    <w:p>
+      <w:pPr>
+        <w:pStyle w:val="ListBullet"/>
+        <w:spacing w:before="20" w:after="40"/>
+      </w:pPr>
+      <w:r>
+        <w:rPr>
+          <w:rFonts w:ascii="Calibri" w:hAnsi="Calibri"/>
+          <w:color w:val="1E293B"/>
+          <w:sz w:val="21"/>
+        </w:rPr>
+        <w:t>In sidebar under "VIEWPORT MODE", toggle between:</w:t>
+      </w:r>
+    </w:p>
+    <w:p>
+      <w:pPr>
+        <w:pStyle w:val="ListBullet"/>
+        <w:spacing w:before="20" w:after="40"/>
+      </w:pPr>
+      <w:r>
+        <w:rPr>
+          <w:rFonts w:ascii="Consolas" w:hAnsi="Consolas"/>
+          <w:color w:val="0F5182"/>
+          <w:sz w:val="19"/>
+        </w:rPr>
+        <w:t>📱 Mobile View (390px)</w:t>
+      </w:r>
+      <w:r>
+        <w:rPr>
+          <w:rFonts w:ascii="Calibri" w:hAnsi="Calibri"/>
+          <w:color w:val="1E293B"/>
+          <w:sz w:val="21"/>
+        </w:rPr>
+        <w:t>: Verify centered smartphone frame, phone drop shadow, single-column stacked elements, and 280px voice recorder.</w:t>
+      </w:r>
+    </w:p>
+    <w:p>
+      <w:pPr>
+        <w:pStyle w:val="ListBullet"/>
+        <w:spacing w:before="20" w:after="40"/>
+      </w:pPr>
+      <w:r>
+        <w:rPr>
+          <w:rFonts w:ascii="Consolas" w:hAnsi="Consolas"/>
+          <w:color w:val="0F5182"/>
+          <w:sz w:val="19"/>
+        </w:rPr>
+        <w:t>📟 Tablet View (820px)</w:t>
+      </w:r>
+      <w:r>
+        <w:rPr>
+          <w:rFonts w:ascii="Calibri" w:hAnsi="Calibri"/>
+          <w:color w:val="1E293B"/>
+          <w:sz w:val="21"/>
+        </w:rPr>
+        <w:t>: Verify centered iPad frame with 2-column wrapping.</w:t>
+      </w:r>
+    </w:p>
+    <w:p>
+      <w:pPr>
+        <w:pStyle w:val="ListBullet"/>
+        <w:spacing w:before="20" w:after="40"/>
+      </w:pPr>
+      <w:r>
+        <w:rPr>
+          <w:rFonts w:ascii="Consolas" w:hAnsi="Consolas"/>
+          <w:color w:val="0F5182"/>
+          <w:sz w:val="19"/>
+        </w:rPr>
+        <w:t>🖥️ Auto (Responsive)</w:t>
+      </w:r>
+      <w:r>
+        <w:rPr>
+          <w:rFonts w:ascii="Calibri" w:hAnsi="Calibri"/>
+          <w:color w:val="1E293B"/>
+          <w:sz w:val="21"/>
+        </w:rPr>
+        <w:t>: Resize browser window to observe natural fluid layout.</w:t>
+      </w:r>
+    </w:p>
+    <w:p>
+      <w:pPr>
+        <w:pStyle w:val="ListNumber"/>
+        <w:spacing w:before="20" w:after="40"/>
+      </w:pPr>
+      <w:r>
+        <w:rPr>
+          <w:rFonts w:ascii="Calibri" w:hAnsi="Calibri"/>
+          <w:b/>
+          <w:color w:val="0F172A"/>
+          <w:sz w:val="21"/>
+        </w:rPr>
         <w:t>Onboarding Gatekeeper &amp; Key Validation:</w:t>
       </w:r>
     </w:p>
@@ -7441,239 +7971,7 @@
           <w:color w:val="1E293B"/>
           <w:sz w:val="21"/>
         </w:rPr>
-        <w:t>Confirm all 101 tests pass (100% pass rate).</w:t>
-      </w:r>
-    </w:p>
-    <w:p>
-      <w:pPr>
-        <w:pStyle w:val="ListNumber"/>
-        <w:spacing w:before="20" w:after="40"/>
-      </w:pPr>
-      <w:r>
-        <w:rPr>
-          <w:rFonts w:ascii="Calibri" w:hAnsi="Calibri"/>
-          <w:b/>
-          <w:color w:val="0F172A"/>
-          <w:sz w:val="21"/>
-        </w:rPr>
-        <w:t>Demonstrate Platform Capabilities:</w:t>
-      </w:r>
-    </w:p>
-    <w:p>
-      <w:pPr>
-        <w:pStyle w:val="ListBullet"/>
-        <w:spacing w:before="20" w:after="40"/>
-      </w:pPr>
-      <w:r>
-        <w:rPr>
-          <w:rFonts w:ascii="Calibri" w:hAnsi="Calibri"/>
-          <w:b/>
-          <w:color w:val="0F172A"/>
-          <w:sz w:val="21"/>
-        </w:rPr>
-        <w:t>Step 1:</w:t>
-      </w:r>
-      <w:r>
-        <w:rPr>
-          <w:rFonts w:ascii="Calibri" w:hAnsi="Calibri"/>
-          <w:color w:val="1E293B"/>
-          <w:sz w:val="21"/>
-        </w:rPr>
-        <w:t xml:space="preserve"> Test both onboarding triggers:</w:t>
-      </w:r>
-    </w:p>
-    <w:p>
-      <w:pPr>
-        <w:pStyle w:val="ListBullet"/>
-        <w:spacing w:before="20" w:after="40"/>
-      </w:pPr>
-      <w:r>
-        <w:rPr>
-          <w:rFonts w:ascii="Calibri" w:hAnsi="Calibri"/>
-          <w:color w:val="1E293B"/>
-          <w:sz w:val="21"/>
-        </w:rPr>
-        <w:t xml:space="preserve">Click </w:t>
-      </w:r>
-      <w:r>
-        <w:rPr>
-          <w:rFonts w:ascii="Calibri" w:hAnsi="Calibri"/>
-          <w:i/>
-          <w:color w:val="334155"/>
-          <w:sz w:val="21"/>
-        </w:rPr>
-        <w:t>"⚡ Load Demo: Fit &amp; Question Bank Only (~10s)"</w:t>
-      </w:r>
-      <w:r>
-        <w:rPr>
-          <w:rFonts w:ascii="Calibri" w:hAnsi="Calibri"/>
-          <w:color w:val="1E293B"/>
-          <w:sz w:val="21"/>
-        </w:rPr>
-        <w:t xml:space="preserve"> and observe 5-stage fast-track execution.</w:t>
-      </w:r>
-    </w:p>
-    <w:p>
-      <w:pPr>
-        <w:pStyle w:val="ListBullet"/>
-        <w:spacing w:before="20" w:after="40"/>
-      </w:pPr>
-      <w:r>
-        <w:rPr>
-          <w:rFonts w:ascii="Calibri" w:hAnsi="Calibri"/>
-          <w:color w:val="1E293B"/>
-          <w:sz w:val="21"/>
-        </w:rPr>
-        <w:t xml:space="preserve">Click </w:t>
-      </w:r>
-      <w:r>
-        <w:rPr>
-          <w:rFonts w:ascii="Calibri" w:hAnsi="Calibri"/>
-          <w:i/>
-          <w:color w:val="334155"/>
-          <w:sz w:val="21"/>
-        </w:rPr>
-        <w:t>"🚀 Load Demo: Complete Pipeline (~35s)"</w:t>
-      </w:r>
-      <w:r>
-        <w:rPr>
-          <w:rFonts w:ascii="Calibri" w:hAnsi="Calibri"/>
-          <w:color w:val="1E293B"/>
-          <w:sz w:val="21"/>
-        </w:rPr>
-        <w:t xml:space="preserve"> and observe 6-stage comprehensive execution.</w:t>
-      </w:r>
-    </w:p>
-    <w:p>
-      <w:pPr>
-        <w:pStyle w:val="ListBullet"/>
-        <w:spacing w:before="20" w:after="40"/>
-      </w:pPr>
-      <w:r>
-        <w:rPr>
-          <w:rFonts w:ascii="Calibri" w:hAnsi="Calibri"/>
-          <w:b/>
-          <w:color w:val="0F172A"/>
-          <w:sz w:val="21"/>
-        </w:rPr>
-        <w:t>Step 2:</w:t>
-      </w:r>
-      <w:r>
-        <w:rPr>
-          <w:rFonts w:ascii="Calibri" w:hAnsi="Calibri"/>
-          <w:color w:val="1E293B"/>
-          <w:sz w:val="21"/>
-        </w:rPr>
-        <w:t xml:space="preserve"> Review the Strategic Fit Report and download both the Full Dossier PDF and the Strategic Fit Report PDF.</w:t>
-      </w:r>
-    </w:p>
-    <w:p>
-      <w:pPr>
-        <w:pStyle w:val="ListBullet"/>
-        <w:spacing w:before="20" w:after="40"/>
-      </w:pPr>
-      <w:r>
-        <w:rPr>
-          <w:rFonts w:ascii="Calibri" w:hAnsi="Calibri"/>
-          <w:b/>
-          <w:color w:val="0F172A"/>
-          <w:sz w:val="21"/>
-        </w:rPr>
-        <w:t>Step 3:</w:t>
-      </w:r>
-      <w:r>
-        <w:rPr>
-          <w:rFonts w:ascii="Calibri" w:hAnsi="Calibri"/>
-          <w:color w:val="1E293B"/>
-          <w:sz w:val="21"/>
-        </w:rPr>
-        <w:t xml:space="preserve"> Inspect the 100% Topic Checklist, export questions in Markdown or Text, and click </w:t>
-      </w:r>
-      <w:r>
-        <w:rPr>
-          <w:rFonts w:ascii="Calibri" w:hAnsi="Calibri"/>
-          <w:i/>
-          <w:color w:val="334155"/>
-          <w:sz w:val="21"/>
-        </w:rPr>
-        <w:t>"Proceed to Step 4"</w:t>
-      </w:r>
-      <w:r>
-        <w:rPr>
-          <w:rFonts w:ascii="Calibri" w:hAnsi="Calibri"/>
-          <w:color w:val="1E293B"/>
-          <w:sz w:val="21"/>
-        </w:rPr>
-        <w:t>.</w:t>
-      </w:r>
-    </w:p>
-    <w:p>
-      <w:pPr>
-        <w:pStyle w:val="ListBullet"/>
-        <w:spacing w:before="20" w:after="40"/>
-      </w:pPr>
-      <w:r>
-        <w:rPr>
-          <w:rFonts w:ascii="Calibri" w:hAnsi="Calibri"/>
-          <w:b/>
-          <w:color w:val="0F172A"/>
-          <w:sz w:val="21"/>
-        </w:rPr>
-        <w:t>Step 4:</w:t>
-      </w:r>
-      <w:r>
-        <w:rPr>
-          <w:rFonts w:ascii="Calibri" w:hAnsi="Calibri"/>
-          <w:color w:val="1E293B"/>
-          <w:sz w:val="21"/>
-        </w:rPr>
-        <w:t xml:space="preserve"> Launch the Online Test (with on-demand calibration if Option 1 was selected) and Voice Interview Simulator with live speech-to-text.</w:t>
-      </w:r>
-    </w:p>
-    <w:p>
-      <w:pPr>
-        <w:pStyle w:val="ListBullet"/>
-        <w:spacing w:before="20" w:after="40"/>
-      </w:pPr>
-      <w:r>
-        <w:rPr>
-          <w:rFonts w:ascii="Calibri" w:hAnsi="Calibri"/>
-          <w:b/>
-          <w:color w:val="0F172A"/>
-          <w:sz w:val="21"/>
-        </w:rPr>
-        <w:t>Step 5:</w:t>
-      </w:r>
-      <w:r>
-        <w:rPr>
-          <w:rFonts w:ascii="Calibri" w:hAnsi="Calibri"/>
-          <w:color w:val="1E293B"/>
-          <w:sz w:val="21"/>
-        </w:rPr>
-        <w:t xml:space="preserve"> Review Unified Diagnostics, download vector Dossier PDF, and launch Closed-Loop Retesting.</w:t>
-      </w:r>
-    </w:p>
-    <w:p>
-      <w:pPr>
-        <w:pStyle w:val="ListBullet"/>
-        <w:spacing w:before="20" w:after="40"/>
-      </w:pPr>
-      <w:r>
-        <w:rPr>
-          <w:rFonts w:ascii="Calibri" w:hAnsi="Calibri"/>
-          <w:b/>
-          <w:color w:val="0F172A"/>
-          <w:sz w:val="21"/>
-        </w:rPr>
-        <w:t>Step 6:</w:t>
-      </w:r>
-      <w:r>
-        <w:rPr>
-          <w:rFonts w:ascii="Calibri" w:hAnsi="Calibri"/>
-          <w:color w:val="1E293B"/>
-          <w:sz w:val="21"/>
-        </w:rPr>
-        <w:t xml:space="preserve"> Inspect the Dynamic 7-Day Prep Curriculum, review curated resources, check off completed items, and track live progress on the 4-stat executive dashboard.</w:t>
+        <w:t>Confirm all 108 tests pass (100% pass rate).</w:t>
       </w:r>
     </w:p>
     <w:p>

</xml_diff>

<commit_message>
feat: harden platform resilience, sanitize evaluation reports, expand CI matrix, and tune responsive layouts
</commit_message>
<xml_diff>
--- a/docs/KT_DOCUMENT.docx
+++ b/docs/KT_DOCUMENT.docx
@@ -7225,6 +7225,598 @@
     </w:p>
     <w:p>
       <w:pPr>
+        <w:pStyle w:val="ListBullet"/>
+        <w:spacing w:before="20" w:after="40"/>
+      </w:pPr>
+      <w:r>
+        <w:rPr>
+          <w:rFonts w:ascii="Calibri" w:hAnsi="Calibri"/>
+          <w:b/>
+          <w:color w:val="0F172A"/>
+          <w:sz w:val="21"/>
+        </w:rPr>
+        <w:t>Session #29 Accomplishments:</w:t>
+      </w:r>
+    </w:p>
+    <w:p>
+      <w:pPr>
+        <w:pStyle w:val="ListNumber"/>
+        <w:spacing w:before="20" w:after="40"/>
+      </w:pPr>
+      <w:r>
+        <w:rPr>
+          <w:rFonts w:ascii="Calibri" w:hAnsi="Calibri"/>
+          <w:color w:val="1E293B"/>
+          <w:sz w:val="21"/>
+        </w:rPr>
+        <w:t>Deployed 4 specialized subagent auditors (Security, Core Pipeline, Frontend, Test/CI) conducting a full-platform audit across all modules and dependencies.</w:t>
+      </w:r>
+    </w:p>
+    <w:p>
+      <w:pPr>
+        <w:pStyle w:val="ListNumber"/>
+        <w:spacing w:before="20" w:after="40"/>
+      </w:pPr>
+      <w:r>
+        <w:rPr>
+          <w:rFonts w:ascii="Calibri" w:hAnsi="Calibri"/>
+          <w:color w:val="1E293B"/>
+          <w:sz w:val="21"/>
+        </w:rPr>
+        <w:t xml:space="preserve">Verified 100% Zero-Leak security: zero API keys or secrets in source code, </w:t>
+      </w:r>
+      <w:r>
+        <w:rPr>
+          <w:rFonts w:ascii="Consolas" w:hAnsi="Consolas"/>
+          <w:color w:val="0F5182"/>
+          <w:sz w:val="19"/>
+        </w:rPr>
+        <w:t>.env</w:t>
+      </w:r>
+      <w:r>
+        <w:rPr>
+          <w:rFonts w:ascii="Calibri" w:hAnsi="Calibri"/>
+          <w:color w:val="1E293B"/>
+          <w:sz w:val="21"/>
+        </w:rPr>
+        <w:t xml:space="preserve"> strictly ignored, and transient key lifecycle verified.</w:t>
+      </w:r>
+    </w:p>
+    <w:p>
+      <w:pPr>
+        <w:pStyle w:val="ListNumber"/>
+        <w:spacing w:before="20" w:after="40"/>
+      </w:pPr>
+      <w:r>
+        <w:rPr>
+          <w:rFonts w:ascii="Calibri" w:hAnsi="Calibri"/>
+          <w:color w:val="1E293B"/>
+          <w:sz w:val="21"/>
+        </w:rPr>
+        <w:t xml:space="preserve">Anonymized </w:t>
+      </w:r>
+      <w:r>
+        <w:rPr>
+          <w:rFonts w:ascii="Consolas" w:hAnsi="Consolas"/>
+          <w:color w:val="0F5182"/>
+          <w:sz w:val="19"/>
+        </w:rPr>
+        <w:t>reference/candidate_evaluation_report.html</w:t>
+      </w:r>
+      <w:r>
+        <w:rPr>
+          <w:rFonts w:ascii="Calibri" w:hAnsi="Calibri"/>
+          <w:color w:val="1E293B"/>
+          <w:sz w:val="21"/>
+        </w:rPr>
+        <w:t xml:space="preserve"> to synthetic demo persona ("Priya Sharma", "DM-DEMO-2026") and added </w:t>
+      </w:r>
+      <w:r>
+        <w:rPr>
+          <w:rFonts w:ascii="Consolas" w:hAnsi="Consolas"/>
+          <w:color w:val="0F5182"/>
+          <w:sz w:val="19"/>
+        </w:rPr>
+        <w:t>reference/</w:t>
+      </w:r>
+      <w:r>
+        <w:rPr>
+          <w:rFonts w:ascii="Calibri" w:hAnsi="Calibri"/>
+          <w:color w:val="1E293B"/>
+          <w:sz w:val="21"/>
+        </w:rPr>
+        <w:t xml:space="preserve"> to </w:t>
+      </w:r>
+      <w:r>
+        <w:rPr>
+          <w:rFonts w:ascii="Consolas" w:hAnsi="Consolas"/>
+          <w:color w:val="0F5182"/>
+          <w:sz w:val="19"/>
+        </w:rPr>
+        <w:t>.gitignore</w:t>
+      </w:r>
+      <w:r>
+        <w:rPr>
+          <w:rFonts w:ascii="Calibri" w:hAnsi="Calibri"/>
+          <w:color w:val="1E293B"/>
+          <w:sz w:val="21"/>
+        </w:rPr>
+        <w:t>.</w:t>
+      </w:r>
+    </w:p>
+    <w:p>
+      <w:pPr>
+        <w:pStyle w:val="ListNumber"/>
+        <w:spacing w:before="20" w:after="40"/>
+      </w:pPr>
+      <w:r>
+        <w:rPr>
+          <w:rFonts w:ascii="Calibri" w:hAnsi="Calibri"/>
+          <w:color w:val="1E293B"/>
+          <w:sz w:val="21"/>
+        </w:rPr>
+        <w:t xml:space="preserve">Sanitized local user filesystem paths in </w:t>
+      </w:r>
+      <w:r>
+        <w:rPr>
+          <w:rFonts w:ascii="Consolas" w:hAnsi="Consolas"/>
+          <w:color w:val="0F5182"/>
+          <w:sz w:val="19"/>
+        </w:rPr>
+        <w:t>docs/PROJECT_LOG.md</w:t>
+      </w:r>
+      <w:r>
+        <w:rPr>
+          <w:rFonts w:ascii="Calibri" w:hAnsi="Calibri"/>
+          <w:color w:val="1E293B"/>
+          <w:sz w:val="21"/>
+        </w:rPr>
+        <w:t xml:space="preserve"> to </w:t>
+      </w:r>
+      <w:r>
+        <w:rPr>
+          <w:rFonts w:ascii="Consolas" w:hAnsi="Consolas"/>
+          <w:color w:val="0F5182"/>
+          <w:sz w:val="19"/>
+        </w:rPr>
+        <w:t>%USERPROFILE%</w:t>
+      </w:r>
+      <w:r>
+        <w:rPr>
+          <w:rFonts w:ascii="Calibri" w:hAnsi="Calibri"/>
+          <w:color w:val="1E293B"/>
+          <w:sz w:val="21"/>
+        </w:rPr>
+        <w:t xml:space="preserve">, converted absolute </w:t>
+      </w:r>
+      <w:r>
+        <w:rPr>
+          <w:rFonts w:ascii="Consolas" w:hAnsi="Consolas"/>
+          <w:color w:val="0F5182"/>
+          <w:sz w:val="19"/>
+        </w:rPr>
+        <w:t>file:///</w:t>
+      </w:r>
+      <w:r>
+        <w:rPr>
+          <w:rFonts w:ascii="Calibri" w:hAnsi="Calibri"/>
+          <w:color w:val="1E293B"/>
+          <w:sz w:val="21"/>
+        </w:rPr>
+        <w:t xml:space="preserve"> URLs to relative links, and updated </w:t>
+      </w:r>
+      <w:r>
+        <w:rPr>
+          <w:rFonts w:ascii="Consolas" w:hAnsi="Consolas"/>
+          <w:color w:val="0F5182"/>
+          <w:sz w:val="19"/>
+        </w:rPr>
+        <w:t>.env.example</w:t>
+      </w:r>
+      <w:r>
+        <w:rPr>
+          <w:rFonts w:ascii="Calibri" w:hAnsi="Calibri"/>
+          <w:color w:val="1E293B"/>
+          <w:sz w:val="21"/>
+        </w:rPr>
+        <w:t xml:space="preserve"> to </w:t>
+      </w:r>
+      <w:r>
+        <w:rPr>
+          <w:rFonts w:ascii="Consolas" w:hAnsi="Consolas"/>
+          <w:color w:val="0F5182"/>
+          <w:sz w:val="19"/>
+        </w:rPr>
+        <w:t>GEMINI_MODEL=gemini-2.5-flash</w:t>
+      </w:r>
+      <w:r>
+        <w:rPr>
+          <w:rFonts w:ascii="Calibri" w:hAnsi="Calibri"/>
+          <w:color w:val="1E293B"/>
+          <w:sz w:val="21"/>
+        </w:rPr>
+        <w:t>.</w:t>
+      </w:r>
+    </w:p>
+    <w:p>
+      <w:pPr>
+        <w:pStyle w:val="ListNumber"/>
+        <w:spacing w:before="20" w:after="40"/>
+      </w:pPr>
+      <w:r>
+        <w:rPr>
+          <w:rFonts w:ascii="Calibri" w:hAnsi="Calibri"/>
+          <w:color w:val="1E293B"/>
+          <w:sz w:val="21"/>
+        </w:rPr>
+        <w:t xml:space="preserve">Hardened core agent pipeline: fixed Stage 3 candidate slice length-descending sorting in </w:t>
+      </w:r>
+      <w:r>
+        <w:rPr>
+          <w:rFonts w:ascii="Consolas" w:hAnsi="Consolas"/>
+          <w:color w:val="0F5182"/>
+          <w:sz w:val="19"/>
+        </w:rPr>
+        <w:t>agents/base_agent.py</w:t>
+      </w:r>
+      <w:r>
+        <w:rPr>
+          <w:rFonts w:ascii="Calibri" w:hAnsi="Calibri"/>
+          <w:color w:val="1E293B"/>
+          <w:sz w:val="21"/>
+        </w:rPr>
+        <w:t xml:space="preserve">, supported dictionary/string challenge objects in </w:t>
+      </w:r>
+      <w:r>
+        <w:rPr>
+          <w:rFonts w:ascii="Consolas" w:hAnsi="Consolas"/>
+          <w:color w:val="0F5182"/>
+          <w:sz w:val="19"/>
+        </w:rPr>
+        <w:t>agents/voice_interview_agent.py</w:t>
+      </w:r>
+      <w:r>
+        <w:rPr>
+          <w:rFonts w:ascii="Calibri" w:hAnsi="Calibri"/>
+          <w:color w:val="1E293B"/>
+          <w:sz w:val="21"/>
+        </w:rPr>
+        <w:t xml:space="preserve">, added per-agent </w:t>
+      </w:r>
+      <w:r>
+        <w:rPr>
+          <w:rFonts w:ascii="Consolas" w:hAnsi="Consolas"/>
+          <w:color w:val="0F5182"/>
+          <w:sz w:val="19"/>
+        </w:rPr>
+        <w:t>GeminiClient</w:t>
+      </w:r>
+      <w:r>
+        <w:rPr>
+          <w:rFonts w:ascii="Calibri" w:hAnsi="Calibri"/>
+          <w:color w:val="1E293B"/>
+          <w:sz w:val="21"/>
+        </w:rPr>
+        <w:t xml:space="preserve"> instantiation in </w:t>
+      </w:r>
+      <w:r>
+        <w:rPr>
+          <w:rFonts w:ascii="Consolas" w:hAnsi="Consolas"/>
+          <w:color w:val="0F5182"/>
+          <w:sz w:val="19"/>
+        </w:rPr>
+        <w:t>orchestrator/orchestrator.py</w:t>
+      </w:r>
+      <w:r>
+        <w:rPr>
+          <w:rFonts w:ascii="Calibri" w:hAnsi="Calibri"/>
+          <w:color w:val="1E293B"/>
+          <w:sz w:val="21"/>
+        </w:rPr>
+        <w:t xml:space="preserve">, and enhanced </w:t>
+      </w:r>
+      <w:r>
+        <w:rPr>
+          <w:rFonts w:ascii="Consolas" w:hAnsi="Consolas"/>
+          <w:color w:val="0F5182"/>
+          <w:sz w:val="19"/>
+        </w:rPr>
+        <w:t>_execute_with_resilience</w:t>
+      </w:r>
+      <w:r>
+        <w:rPr>
+          <w:rFonts w:ascii="Calibri" w:hAnsi="Calibri"/>
+          <w:color w:val="1E293B"/>
+          <w:sz w:val="21"/>
+        </w:rPr>
+        <w:t xml:space="preserve"> in </w:t>
+      </w:r>
+      <w:r>
+        <w:rPr>
+          <w:rFonts w:ascii="Consolas" w:hAnsi="Consolas"/>
+          <w:color w:val="0F5182"/>
+          <w:sz w:val="19"/>
+        </w:rPr>
+        <w:t>utils/gemini_client.py</w:t>
+      </w:r>
+      <w:r>
+        <w:rPr>
+          <w:rFonts w:ascii="Calibri" w:hAnsi="Calibri"/>
+          <w:color w:val="1E293B"/>
+          <w:sz w:val="21"/>
+        </w:rPr>
+        <w:t xml:space="preserve"> with 503/500/network error retries and model cascade fallback.</w:t>
+      </w:r>
+    </w:p>
+    <w:p>
+      <w:pPr>
+        <w:pStyle w:val="ListNumber"/>
+        <w:spacing w:before="20" w:after="40"/>
+      </w:pPr>
+      <w:r>
+        <w:rPr>
+          <w:rFonts w:ascii="Calibri" w:hAnsi="Calibri"/>
+          <w:color w:val="1E293B"/>
+          <w:sz w:val="21"/>
+        </w:rPr>
+        <w:t xml:space="preserve">Polished frontend UI/UX: fixed Step 6 curriculum regeneration crash in </w:t>
+      </w:r>
+      <w:r>
+        <w:rPr>
+          <w:rFonts w:ascii="Consolas" w:hAnsi="Consolas"/>
+          <w:color w:val="0F5182"/>
+          <w:sz w:val="19"/>
+        </w:rPr>
+        <w:t>frontend/app.py</w:t>
+      </w:r>
+      <w:r>
+        <w:rPr>
+          <w:rFonts w:ascii="Calibri" w:hAnsi="Calibri"/>
+          <w:color w:val="1E293B"/>
+          <w:sz w:val="21"/>
+        </w:rPr>
+        <w:t xml:space="preserve">, guarded checkbox set removal, replaced </w:t>
+      </w:r>
+      <w:r>
+        <w:rPr>
+          <w:rFonts w:ascii="Consolas" w:hAnsi="Consolas"/>
+          <w:color w:val="0F5182"/>
+          <w:sz w:val="19"/>
+        </w:rPr>
+        <w:t>window.blur</w:t>
+      </w:r>
+      <w:r>
+        <w:rPr>
+          <w:rFonts w:ascii="Calibri" w:hAnsi="Calibri"/>
+          <w:color w:val="1E293B"/>
+          <w:sz w:val="21"/>
+        </w:rPr>
+        <w:t xml:space="preserve"> with </w:t>
+      </w:r>
+      <w:r>
+        <w:rPr>
+          <w:rFonts w:ascii="Consolas" w:hAnsi="Consolas"/>
+          <w:color w:val="0F5182"/>
+          <w:sz w:val="19"/>
+        </w:rPr>
+        <w:t>document.visibilitychange</w:t>
+      </w:r>
+      <w:r>
+        <w:rPr>
+          <w:rFonts w:ascii="Calibri" w:hAnsi="Calibri"/>
+          <w:color w:val="1E293B"/>
+          <w:sz w:val="21"/>
+        </w:rPr>
+        <w:t xml:space="preserve"> in </w:t>
+      </w:r>
+      <w:r>
+        <w:rPr>
+          <w:rFonts w:ascii="Consolas" w:hAnsi="Consolas"/>
+          <w:color w:val="0F5182"/>
+          <w:sz w:val="19"/>
+        </w:rPr>
+        <w:t>exam_timer.html</w:t>
+      </w:r>
+      <w:r>
+        <w:rPr>
+          <w:rFonts w:ascii="Calibri" w:hAnsi="Calibri"/>
+          <w:color w:val="1E293B"/>
+          <w:sz w:val="21"/>
+        </w:rPr>
+        <w:t xml:space="preserve"> to prevent false positive tab-blur warnings on MCQ clicks, added SVG icons for </w:t>
+      </w:r>
+      <w:r>
+        <w:rPr>
+          <w:rFonts w:ascii="Consolas" w:hAnsi="Consolas"/>
+          <w:color w:val="0F5182"/>
+          <w:sz w:val="19"/>
+        </w:rPr>
+        <w:t>code</w:t>
+      </w:r>
+      <w:r>
+        <w:rPr>
+          <w:rFonts w:ascii="Calibri" w:hAnsi="Calibri"/>
+          <w:color w:val="1E293B"/>
+          <w:sz w:val="21"/>
+        </w:rPr>
+        <w:t xml:space="preserve">, </w:t>
+      </w:r>
+      <w:r>
+        <w:rPr>
+          <w:rFonts w:ascii="Consolas" w:hAnsi="Consolas"/>
+          <w:color w:val="0F5182"/>
+          <w:sz w:val="19"/>
+        </w:rPr>
+        <w:t>user</w:t>
+      </w:r>
+      <w:r>
+        <w:rPr>
+          <w:rFonts w:ascii="Calibri" w:hAnsi="Calibri"/>
+          <w:color w:val="1E293B"/>
+          <w:sz w:val="21"/>
+        </w:rPr>
+        <w:t xml:space="preserve">, and </w:t>
+      </w:r>
+      <w:r>
+        <w:rPr>
+          <w:rFonts w:ascii="Consolas" w:hAnsi="Consolas"/>
+          <w:color w:val="0F5182"/>
+          <w:sz w:val="19"/>
+        </w:rPr>
+        <w:t>clipboard</w:t>
+      </w:r>
+      <w:r>
+        <w:rPr>
+          <w:rFonts w:ascii="Calibri" w:hAnsi="Calibri"/>
+          <w:color w:val="1E293B"/>
+          <w:sz w:val="21"/>
+        </w:rPr>
+        <w:t xml:space="preserve"> in </w:t>
+      </w:r>
+      <w:r>
+        <w:rPr>
+          <w:rFonts w:ascii="Consolas" w:hAnsi="Consolas"/>
+          <w:color w:val="0F5182"/>
+          <w:sz w:val="19"/>
+        </w:rPr>
+        <w:t>frontend/components/icons.py</w:t>
+      </w:r>
+      <w:r>
+        <w:rPr>
+          <w:rFonts w:ascii="Calibri" w:hAnsi="Calibri"/>
+          <w:color w:val="1E293B"/>
+          <w:sz w:val="21"/>
+        </w:rPr>
+        <w:t xml:space="preserve">, and scoped 50% tablet metric wrapping and mobile checkbox protection in </w:t>
+      </w:r>
+      <w:r>
+        <w:rPr>
+          <w:rFonts w:ascii="Consolas" w:hAnsi="Consolas"/>
+          <w:color w:val="0F5182"/>
+          <w:sz w:val="19"/>
+        </w:rPr>
+        <w:t>theme.py</w:t>
+      </w:r>
+      <w:r>
+        <w:rPr>
+          <w:rFonts w:ascii="Calibri" w:hAnsi="Calibri"/>
+          <w:color w:val="1E293B"/>
+          <w:sz w:val="21"/>
+        </w:rPr>
+        <w:t xml:space="preserve"> and </w:t>
+      </w:r>
+      <w:r>
+        <w:rPr>
+          <w:rFonts w:ascii="Consolas" w:hAnsi="Consolas"/>
+          <w:color w:val="0F5182"/>
+          <w:sz w:val="19"/>
+        </w:rPr>
+        <w:t>neumorphism.css</w:t>
+      </w:r>
+      <w:r>
+        <w:rPr>
+          <w:rFonts w:ascii="Calibri" w:hAnsi="Calibri"/>
+          <w:color w:val="1E293B"/>
+          <w:sz w:val="21"/>
+        </w:rPr>
+        <w:t>.</w:t>
+      </w:r>
+    </w:p>
+    <w:p>
+      <w:pPr>
+        <w:pStyle w:val="ListNumber"/>
+        <w:spacing w:before="20" w:after="40"/>
+      </w:pPr>
+      <w:r>
+        <w:rPr>
+          <w:rFonts w:ascii="Calibri" w:hAnsi="Calibri"/>
+          <w:color w:val="1E293B"/>
+          <w:sz w:val="21"/>
+        </w:rPr>
+        <w:t xml:space="preserve">Modernized CI/CD: added Python 3.12 to </w:t>
+      </w:r>
+      <w:r>
+        <w:rPr>
+          <w:rFonts w:ascii="Consolas" w:hAnsi="Consolas"/>
+          <w:color w:val="0F5182"/>
+          <w:sz w:val="19"/>
+        </w:rPr>
+        <w:t>.github/workflows/ci.yml</w:t>
+      </w:r>
+      <w:r>
+        <w:rPr>
+          <w:rFonts w:ascii="Calibri" w:hAnsi="Calibri"/>
+          <w:color w:val="1E293B"/>
+          <w:sz w:val="21"/>
+        </w:rPr>
+        <w:t xml:space="preserve"> build matrix alongside 3.10 and 3.11 with system </w:t>
+      </w:r>
+      <w:r>
+        <w:rPr>
+          <w:rFonts w:ascii="Consolas" w:hAnsi="Consolas"/>
+          <w:color w:val="0F5182"/>
+          <w:sz w:val="19"/>
+        </w:rPr>
+        <w:t>ffmpeg</w:t>
+      </w:r>
+      <w:r>
+        <w:rPr>
+          <w:rFonts w:ascii="Calibri" w:hAnsi="Calibri"/>
+          <w:color w:val="1E293B"/>
+          <w:sz w:val="21"/>
+        </w:rPr>
+        <w:t xml:space="preserve"> installation, and cleaned 848 orphaned local session files from </w:t>
+      </w:r>
+      <w:r>
+        <w:rPr>
+          <w:rFonts w:ascii="Consolas" w:hAnsi="Consolas"/>
+          <w:color w:val="0F5182"/>
+          <w:sz w:val="19"/>
+        </w:rPr>
+        <w:t>data/sessions/</w:t>
+      </w:r>
+      <w:r>
+        <w:rPr>
+          <w:rFonts w:ascii="Calibri" w:hAnsi="Calibri"/>
+          <w:color w:val="1E293B"/>
+          <w:sz w:val="21"/>
+        </w:rPr>
+        <w:t>.</w:t>
+      </w:r>
+    </w:p>
+    <w:p>
+      <w:pPr>
+        <w:pStyle w:val="ListNumber"/>
+        <w:spacing w:before="20" w:after="40"/>
+      </w:pPr>
+      <w:r>
+        <w:rPr>
+          <w:rFonts w:ascii="Calibri" w:hAnsi="Calibri"/>
+          <w:color w:val="1E293B"/>
+          <w:sz w:val="21"/>
+        </w:rPr>
+        <w:t xml:space="preserve">Verified 100% test pass rate across all </w:t>
+      </w:r>
+      <w:r>
+        <w:rPr>
+          <w:rFonts w:ascii="Calibri" w:hAnsi="Calibri"/>
+          <w:b/>
+          <w:color w:val="0F172A"/>
+          <w:sz w:val="21"/>
+        </w:rPr>
+        <w:t>108 tests</w:t>
+      </w:r>
+      <w:r>
+        <w:rPr>
+          <w:rFonts w:ascii="Calibri" w:hAnsi="Calibri"/>
+          <w:color w:val="1E293B"/>
+          <w:sz w:val="21"/>
+        </w:rPr>
+        <w:t xml:space="preserve"> in 33.2s with zero failures, zero errors, and zero warnings.</w:t>
+      </w:r>
+    </w:p>
+    <w:p>
+      <w:pPr>
         <w:spacing w:before="200" w:after="60"/>
       </w:pPr>
       <w:r>
@@ -7257,7 +7849,7 @@
           <w:color w:val="1E293B"/>
           <w:sz w:val="21"/>
         </w:rPr>
-        <w:t xml:space="preserve"> Mobile and Tablet viewport modes, responsive CSS grid engine, touch ergonomics, and comprehensive documentation have been completely implemented and verified.</w:t>
+        <w:t xml:space="preserve"> Full-platform comprehensive code review, security hardening, resilience improvements, PII sanitization, and responsive CSS tuning have been completely implemented and verified.</w:t>
       </w:r>
     </w:p>
     <w:p>
@@ -7280,7 +7872,7 @@
           <w:color w:val="1E293B"/>
           <w:sz w:val="21"/>
         </w:rPr>
-        <w:t xml:space="preserve"> 100% test pass rate across all 108 tests in 32.4s with zero regressions.</w:t>
+        <w:t xml:space="preserve"> 100% test pass rate across all 108 tests in 33.2s with zero regressions.</w:t>
       </w:r>
     </w:p>
     <w:p>
@@ -7335,7 +7927,7 @@
           <w:color w:val="1E293B"/>
           <w:sz w:val="21"/>
         </w:rPr>
-        <w:t xml:space="preserve"> manuals before closing the session.</w:t>
+        <w:t xml:space="preserve"> manuals before pushing changes to GitHub.</w:t>
       </w:r>
     </w:p>
     <w:p>
@@ -7552,7 +8144,7 @@
           <w:color w:val="0F172A"/>
           <w:sz w:val="21"/>
         </w:rPr>
-        <w:t>Streamlit Community Cloud Deployment Verification:</w:t>
+        <w:t>GitHub Remote &amp; Streamlit Cloud Verification:</w:t>
       </w:r>
     </w:p>
     <w:p>
@@ -7566,7 +8158,23 @@
           <w:color w:val="1E293B"/>
           <w:sz w:val="21"/>
         </w:rPr>
-        <w:t>Navigate to [share.streamlit.io](https://share.streamlit.io).</w:t>
+        <w:t xml:space="preserve">Confirm GitHub Actions CI status on </w:t>
+      </w:r>
+      <w:r>
+        <w:rPr>
+          <w:rFonts w:ascii="Consolas" w:hAnsi="Consolas"/>
+          <w:color w:val="0F5182"/>
+          <w:sz w:val="19"/>
+        </w:rPr>
+        <w:t>Hello-Nitish/Interview_IQ</w:t>
+      </w:r>
+      <w:r>
+        <w:rPr>
+          <w:rFonts w:ascii="Calibri" w:hAnsi="Calibri"/>
+          <w:color w:val="1E293B"/>
+          <w:sz w:val="21"/>
+        </w:rPr>
+        <w:t xml:space="preserve"> across Python 3.10, 3.11, and 3.12.</w:t>
       </w:r>
     </w:p>
     <w:p>
@@ -7580,7 +8188,7 @@
           <w:color w:val="1E293B"/>
           <w:sz w:val="21"/>
         </w:rPr>
-        <w:t xml:space="preserve">Confirm application status for </w:t>
+        <w:t xml:space="preserve">Confirm application status on [share.streamlit.io](https://share.streamlit.io) for </w:t>
       </w:r>
       <w:r>
         <w:rPr>
@@ -7780,7 +8388,7 @@
           <w:color w:val="1E293B"/>
           <w:sz w:val="21"/>
         </w:rPr>
-        <w:t>: Verify centered smartphone frame, phone drop shadow, single-column stacked elements, and 280px voice recorder.</w:t>
+        <w:t>: Verify centered smartphone frame, single-column stacked elements, and 280px voice recorder.</w:t>
       </w:r>
     </w:p>
     <w:p>
@@ -7802,7 +8410,7 @@
           <w:color w:val="1E293B"/>
           <w:sz w:val="21"/>
         </w:rPr>
-        <w:t>: Verify centered iPad frame with 2-column wrapping.</w:t>
+        <w:t>: Verify centered tablet frame with 2-column wrapping on metric cards and inline checkboxes.</w:t>
       </w:r>
     </w:p>
     <w:p>
@@ -7878,7 +8486,7 @@
           <w:color w:val="0F5182"/>
           <w:sz w:val="19"/>
         </w:rPr>
-        <w:t>gemini-2.0-flash</w:t>
+        <w:t>gemini-2.5-flash</w:t>
       </w:r>
       <w:r>
         <w:rPr>

</xml_diff>

<commit_message>
feat: overhaul mobile view experience with 2x2 metric decks, touch pill radios, and responsive tables
</commit_message>
<xml_diff>
--- a/docs/KT_DOCUMENT.docx
+++ b/docs/KT_DOCUMENT.docx
@@ -7826,7 +7826,7 @@
           <w:color w:val="2563EB"/>
           <w:sz w:val="25"/>
         </w:rPr>
-        <w:t>Why We Stopped</w:t>
+        <w:t>Session #30 Knowledge Transfer: Mobile Viewport Experience Overhaul</w:t>
       </w:r>
     </w:p>
     <w:p>
@@ -7841,15 +7841,63 @@
           <w:color w:val="0F172A"/>
           <w:sz w:val="21"/>
         </w:rPr>
-        <w:t>Scope Realization:</w:t>
-      </w:r>
-      <w:r>
-        <w:rPr>
-          <w:rFonts w:ascii="Calibri" w:hAnsi="Calibri"/>
-          <w:color w:val="1E293B"/>
-          <w:sz w:val="21"/>
-        </w:rPr>
-        <w:t xml:space="preserve"> Full-platform comprehensive code review, security hardening, resilience improvements, PII sanitization, and responsive CSS tuning have been completely implemented and verified.</w:t>
+        <w:t>Executive 2x2 Metric Grids:</w:t>
+      </w:r>
+      <w:r>
+        <w:rPr>
+          <w:rFonts w:ascii="Calibri" w:hAnsi="Calibri"/>
+          <w:color w:val="1E293B"/>
+          <w:sz w:val="21"/>
+        </w:rPr>
+        <w:t xml:space="preserve"> 4-column decks (</w:t>
+      </w:r>
+      <w:r>
+        <w:rPr>
+          <w:rFonts w:ascii="Consolas" w:hAnsi="Consolas"/>
+          <w:color w:val="0F5182"/>
+          <w:sz w:val="19"/>
+        </w:rPr>
+        <w:t>st.columns(4)</w:t>
+      </w:r>
+      <w:r>
+        <w:rPr>
+          <w:rFonts w:ascii="Calibri" w:hAnsi="Calibri"/>
+          <w:color w:val="1E293B"/>
+          <w:sz w:val="21"/>
+        </w:rPr>
+        <w:t>) in simulated mobile view (</w:t>
+      </w:r>
+      <w:r>
+        <w:rPr>
+          <w:rFonts w:ascii="Consolas" w:hAnsi="Consolas"/>
+          <w:color w:val="0F5182"/>
+          <w:sz w:val="19"/>
+        </w:rPr>
+        <w:t>📱 Mobile View (390px)</w:t>
+      </w:r>
+      <w:r>
+        <w:rPr>
+          <w:rFonts w:ascii="Calibri" w:hAnsi="Calibri"/>
+          <w:color w:val="1E293B"/>
+          <w:sz w:val="21"/>
+        </w:rPr>
+        <w:t>) and small screens wrap cleanly into an executive 2x2 grid (</w:t>
+      </w:r>
+      <w:r>
+        <w:rPr>
+          <w:rFonts w:ascii="Consolas" w:hAnsi="Consolas"/>
+          <w:color w:val="0F5182"/>
+          <w:sz w:val="19"/>
+        </w:rPr>
+        <w:t>min-width: calc(50% - 6px)</w:t>
+      </w:r>
+      <w:r>
+        <w:rPr>
+          <w:rFonts w:ascii="Calibri" w:hAnsi="Calibri"/>
+          <w:color w:val="1E293B"/>
+          <w:sz w:val="21"/>
+        </w:rPr>
+        <w:t>), cutting vertical screen scroll by 50% and preventing cramped 4-card single vertical stacks.</w:t>
       </w:r>
     </w:p>
     <w:p>
@@ -7864,6 +7912,231 @@
           <w:color w:val="0F172A"/>
           <w:sz w:val="21"/>
         </w:rPr>
+        <w:t>Physical Phone Frame Conditioning:</w:t>
+      </w:r>
+      <w:r>
+        <w:rPr>
+          <w:rFonts w:ascii="Calibri" w:hAnsi="Calibri"/>
+          <w:color w:val="1E293B"/>
+          <w:sz w:val="21"/>
+        </w:rPr>
+        <w:t xml:space="preserve"> The preview phone notch and border styling in </w:t>
+      </w:r>
+      <w:r>
+        <w:rPr>
+          <w:rFonts w:ascii="Consolas" w:hAnsi="Consolas"/>
+          <w:color w:val="0F5182"/>
+          <w:sz w:val="19"/>
+        </w:rPr>
+        <w:t>frontend/styles/theme.py</w:t>
+      </w:r>
+      <w:r>
+        <w:rPr>
+          <w:rFonts w:ascii="Calibri" w:hAnsi="Calibri"/>
+          <w:color w:val="1E293B"/>
+          <w:sz w:val="21"/>
+        </w:rPr>
+        <w:t xml:space="preserve"> is conditioned with </w:t>
+      </w:r>
+      <w:r>
+        <w:rPr>
+          <w:rFonts w:ascii="Consolas" w:hAnsi="Consolas"/>
+          <w:color w:val="0F5182"/>
+          <w:sz w:val="19"/>
+        </w:rPr>
+        <w:t>@media (min-width: 601px)</w:t>
+      </w:r>
+      <w:r>
+        <w:rPr>
+          <w:rFonts w:ascii="Calibri" w:hAnsi="Calibri"/>
+          <w:color w:val="1E293B"/>
+          <w:sz w:val="21"/>
+        </w:rPr>
+        <w:t>. On real smartphones (</w:t>
+      </w:r>
+      <w:r>
+        <w:rPr>
+          <w:rFonts w:ascii="Consolas" w:hAnsi="Consolas"/>
+          <w:color w:val="0F5182"/>
+          <w:sz w:val="19"/>
+        </w:rPr>
+        <w:t>&lt;= 600px</w:t>
+      </w:r>
+      <w:r>
+        <w:rPr>
+          <w:rFonts w:ascii="Calibri" w:hAnsi="Calibri"/>
+          <w:color w:val="1E293B"/>
+          <w:sz w:val="21"/>
+        </w:rPr>
+        <w:t>), the app renders edge-to-edge naturally without artificial nested frames.</w:t>
+      </w:r>
+    </w:p>
+    <w:p>
+      <w:pPr>
+        <w:pStyle w:val="ListNumber"/>
+        <w:spacing w:before="20" w:after="40"/>
+      </w:pPr>
+      <w:r>
+        <w:rPr>
+          <w:rFonts w:ascii="Calibri" w:hAnsi="Calibri"/>
+          <w:b/>
+          <w:color w:val="0F172A"/>
+          <w:sz w:val="21"/>
+        </w:rPr>
+        <w:t>Responsive Table Momentum Scrolling:</w:t>
+      </w:r>
+      <w:r>
+        <w:rPr>
+          <w:rFonts w:ascii="Calibri" w:hAnsi="Calibri"/>
+          <w:color w:val="1E293B"/>
+          <w:sz w:val="21"/>
+        </w:rPr>
+        <w:t xml:space="preserve"> All primary data tables across Step 2 (Requirements Matrix), Step 3 (Question Bank), and Step 5 (Topic Accuracy &amp; Unified Readiness) are wrapped in </w:t>
+      </w:r>
+      <w:r>
+        <w:rPr>
+          <w:rFonts w:ascii="Consolas" w:hAnsi="Consolas"/>
+          <w:color w:val="0F5182"/>
+          <w:sz w:val="19"/>
+        </w:rPr>
+        <w:t>.neuro-table-responsive</w:t>
+      </w:r>
+      <w:r>
+        <w:rPr>
+          <w:rFonts w:ascii="Calibri" w:hAnsi="Calibri"/>
+          <w:color w:val="1E293B"/>
+          <w:sz w:val="21"/>
+        </w:rPr>
+        <w:t xml:space="preserve"> with </w:t>
+      </w:r>
+      <w:r>
+        <w:rPr>
+          <w:rFonts w:ascii="Consolas" w:hAnsi="Consolas"/>
+          <w:color w:val="0F5182"/>
+          <w:sz w:val="19"/>
+        </w:rPr>
+        <w:t>min-width: 560px</w:t>
+      </w:r>
+      <w:r>
+        <w:rPr>
+          <w:rFonts w:ascii="Calibri" w:hAnsi="Calibri"/>
+          <w:color w:val="1E293B"/>
+          <w:sz w:val="21"/>
+        </w:rPr>
+        <w:t xml:space="preserve"> and custom sleek scrollbars, preventing multi-column squishing on 390px screens.</w:t>
+      </w:r>
+    </w:p>
+    <w:p>
+      <w:pPr>
+        <w:pStyle w:val="ListNumber"/>
+        <w:spacing w:before="20" w:after="40"/>
+      </w:pPr>
+      <w:r>
+        <w:rPr>
+          <w:rFonts w:ascii="Calibri" w:hAnsi="Calibri"/>
+          <w:b/>
+          <w:color w:val="0F172A"/>
+          <w:sz w:val="21"/>
+        </w:rPr>
+        <w:t>Touch Ergonomics:</w:t>
+      </w:r>
+      <w:r>
+        <w:rPr>
+          <w:rFonts w:ascii="Calibri" w:hAnsi="Calibri"/>
+          <w:color w:val="1E293B"/>
+          <w:sz w:val="21"/>
+        </w:rPr>
+        <w:t xml:space="preserve"> Radio option groups wrap as touch pills (</w:t>
+      </w:r>
+      <w:r>
+        <w:rPr>
+          <w:rFonts w:ascii="Consolas" w:hAnsi="Consolas"/>
+          <w:color w:val="0F5182"/>
+          <w:sz w:val="19"/>
+        </w:rPr>
+        <w:t>gap: 8px; flex-wrap: wrap;</w:t>
+      </w:r>
+      <w:r>
+        <w:rPr>
+          <w:rFonts w:ascii="Calibri" w:hAnsi="Calibri"/>
+          <w:color w:val="1E293B"/>
+          <w:sz w:val="21"/>
+        </w:rPr>
+        <w:t>), and tab bars support smooth horizontal touch scrolling.</w:t>
+      </w:r>
+    </w:p>
+    <w:p>
+      <w:pPr>
+        <w:pStyle w:val="ListNumber"/>
+        <w:spacing w:before="20" w:after="40"/>
+      </w:pPr>
+      <w:r>
+        <w:rPr>
+          <w:rFonts w:ascii="Calibri" w:hAnsi="Calibri"/>
+          <w:b/>
+          <w:color w:val="0F172A"/>
+          <w:sz w:val="21"/>
+        </w:rPr>
+        <w:t>Zero Test Regressions:</w:t>
+      </w:r>
+      <w:r>
+        <w:rPr>
+          <w:rFonts w:ascii="Calibri" w:hAnsi="Calibri"/>
+          <w:color w:val="1E293B"/>
+          <w:sz w:val="21"/>
+        </w:rPr>
+        <w:t xml:space="preserve"> All 108 automated unit and UAT tests verified passing (100% pass rate in 14.4s).</w:t>
+      </w:r>
+    </w:p>
+    <w:p>
+      <w:pPr>
+        <w:spacing w:before="200" w:after="60"/>
+      </w:pPr>
+      <w:r>
+        <w:rPr>
+          <w:rFonts w:ascii="Calibri" w:hAnsi="Calibri"/>
+          <w:b/>
+          <w:color w:val="2563EB"/>
+          <w:sz w:val="25"/>
+        </w:rPr>
+        <w:t>Why We Stopped</w:t>
+      </w:r>
+    </w:p>
+    <w:p>
+      <w:pPr>
+        <w:pStyle w:val="ListNumber"/>
+        <w:spacing w:before="20" w:after="40"/>
+      </w:pPr>
+      <w:r>
+        <w:rPr>
+          <w:rFonts w:ascii="Calibri" w:hAnsi="Calibri"/>
+          <w:b/>
+          <w:color w:val="0F172A"/>
+          <w:sz w:val="21"/>
+        </w:rPr>
+        <w:t>Scope Realization:</w:t>
+      </w:r>
+      <w:r>
+        <w:rPr>
+          <w:rFonts w:ascii="Calibri" w:hAnsi="Calibri"/>
+          <w:color w:val="1E293B"/>
+          <w:sz w:val="21"/>
+        </w:rPr>
+        <w:t xml:space="preserve"> Mobile view experience optimization, responsive grid enhancement, table overflow remediation, and frame conditioning are fully implemented and verified.</w:t>
+      </w:r>
+    </w:p>
+    <w:p>
+      <w:pPr>
+        <w:pStyle w:val="ListNumber"/>
+        <w:spacing w:before="20" w:after="40"/>
+      </w:pPr>
+      <w:r>
+        <w:rPr>
+          <w:rFonts w:ascii="Calibri" w:hAnsi="Calibri"/>
+          <w:b/>
+          <w:color w:val="0F172A"/>
+          <w:sz w:val="21"/>
+        </w:rPr>
         <w:t>Quality Verification:</w:t>
       </w:r>
       <w:r>
@@ -7872,7 +8145,7 @@
           <w:color w:val="1E293B"/>
           <w:sz w:val="21"/>
         </w:rPr>
-        <w:t xml:space="preserve"> 100% test pass rate across all 108 tests in 33.2s with zero regressions.</w:t>
+        <w:t xml:space="preserve"> 100% test pass rate across all 108 tests in 14.4s with zero regressions.</w:t>
       </w:r>
     </w:p>
     <w:p>
@@ -8388,7 +8661,7 @@
           <w:color w:val="1E293B"/>
           <w:sz w:val="21"/>
         </w:rPr>
-        <w:t>: Verify centered smartphone frame, single-column stacked elements, and 280px voice recorder.</w:t>
+        <w:t>: Verify centered smartphone frame, single-column stacked elements, 2x2 metric decks, touch pill radios, and touch-scrollable tables.</w:t>
       </w:r>
     </w:p>
     <w:p>

</xml_diff>